<commit_message>
Document published model modalities and context limits with sources
</commit_message>
<xml_diff>
--- a/reports/2026-09-22-Auto-Claims-Classification-Executive-Report.docx
+++ b/reports/2026-09-22-Auto-Claims-Classification-Executive-Report.docx
@@ -631,7 +631,7 @@
         <w:rPr>
           <w:b w:val="0"/>
         </w:rPr>
-        <w:t>Reading guide: original study on pages 2–10; native scores and boundary results on pages 11–12; complete boundary documents on pages 13–14.</w:t>
+        <w:t>Reading guide: original study on pages 2–10; native scores and boundary results on pages 11–12; complete boundary documents on pages 13–14; published capabilities and evidence on page 15.</w:t>
       </w:r>
     </w:p>
     <w:p>
@@ -10247,6 +10247,685 @@
         <w:t>Expected: other  |  Confusable with: demand_letter</w:t>
       </w:r>
     </w:p>
+    <w:p>
+      <w:r>
+        <w:br w:type="page"/>
+      </w:r>
+    </w:p>
+    <w:p>
+      <w:pPr>
+        <w:pStyle w:val="Heading1"/>
+      </w:pPr>
+      <w:r>
+        <w:t>Published capabilities and supporting evidence</w:t>
+      </w:r>
+    </w:p>
+    <w:p>
+      <w:r>
+        <w:rPr>
+          <w:b w:val="0"/>
+        </w:rPr>
+        <w:t>Verified 22 September 2026. Published service limits, encoder capacity, and tested document budgets are distinct. No new inference was performed for this research update.</w:t>
+      </w:r>
+    </w:p>
+    <w:tbl>
+      <w:tblPr>
+        <w:tblW w:type="auto" w:w="0"/>
+        <w:jc w:val="center"/>
+        <w:tblLayout w:type="fixed"/>
+        <w:tblLook w:firstColumn="1" w:firstRow="1" w:lastColumn="0" w:lastRow="0" w:noHBand="0" w:noVBand="1" w:val="04A0"/>
+      </w:tblPr>
+      <w:tblGrid>
+        <w:gridCol w:w="1224"/>
+        <w:gridCol w:w="2592"/>
+        <w:gridCol w:w="3816"/>
+        <w:gridCol w:w="2448"/>
+      </w:tblGrid>
+      <w:tr>
+        <w:trPr>
+          <w:cantSplit/>
+          <w:tblHeader/>
+        </w:trPr>
+        <w:tc>
+          <w:tcPr>
+            <w:tcW w:type="dxa" w:w="1224"/>
+            <w:vAlign w:val="center"/>
+            <w:shd w:fill="17354A"/>
+            <w:tcBorders>
+              <w:top w:val="single" w:sz="4" w:color="D9D9D9"/>
+              <w:left w:val="single" w:sz="4" w:color="D9D9D9"/>
+              <w:bottom w:val="single" w:sz="4" w:color="D9D9D9"/>
+              <w:right w:val="single" w:sz="4" w:color="D9D9D9"/>
+            </w:tcBorders>
+            <w:tcMar>
+              <w:top w:w="90" w:type="dxa"/>
+              <w:bottom w:w="90" w:type="dxa"/>
+              <w:left w:w="90" w:type="dxa"/>
+              <w:right w:w="90" w:type="dxa"/>
+            </w:tcMar>
+          </w:tcPr>
+          <w:p>
+            <w:pPr>
+              <w:spacing w:after="20" w:before="20" w:line="247" w:lineRule="auto"/>
+            </w:pPr>
+            <w:r>
+              <w:rPr>
+                <w:b/>
+                <w:color w:val="FFFFFF"/>
+                <w:sz w:val="18"/>
+              </w:rPr>
+              <w:t>Model</w:t>
+            </w:r>
+          </w:p>
+        </w:tc>
+        <w:tc>
+          <w:tcPr>
+            <w:tcW w:type="dxa" w:w="2592"/>
+            <w:vAlign w:val="center"/>
+            <w:shd w:fill="17354A"/>
+            <w:tcBorders>
+              <w:top w:val="single" w:sz="4" w:color="D9D9D9"/>
+              <w:left w:val="single" w:sz="4" w:color="D9D9D9"/>
+              <w:bottom w:val="single" w:sz="4" w:color="D9D9D9"/>
+              <w:right w:val="single" w:sz="4" w:color="D9D9D9"/>
+            </w:tcBorders>
+            <w:tcMar>
+              <w:top w:w="90" w:type="dxa"/>
+              <w:bottom w:w="90" w:type="dxa"/>
+              <w:left w:w="90" w:type="dxa"/>
+              <w:right w:w="90" w:type="dxa"/>
+            </w:tcMar>
+          </w:tcPr>
+          <w:p>
+            <w:pPr>
+              <w:spacing w:after="20" w:before="20" w:line="247" w:lineRule="auto"/>
+            </w:pPr>
+            <w:r>
+              <w:rPr>
+                <w:b/>
+                <w:color w:val="FFFFFF"/>
+                <w:sz w:val="18"/>
+              </w:rPr>
+              <w:t>Supported inputs</w:t>
+            </w:r>
+          </w:p>
+        </w:tc>
+        <w:tc>
+          <w:tcPr>
+            <w:tcW w:type="dxa" w:w="3816"/>
+            <w:vAlign w:val="center"/>
+            <w:shd w:fill="17354A"/>
+            <w:tcBorders>
+              <w:top w:val="single" w:sz="4" w:color="D9D9D9"/>
+              <w:left w:val="single" w:sz="4" w:color="D9D9D9"/>
+              <w:bottom w:val="single" w:sz="4" w:color="D9D9D9"/>
+              <w:right w:val="single" w:sz="4" w:color="D9D9D9"/>
+            </w:tcBorders>
+            <w:tcMar>
+              <w:top w:w="90" w:type="dxa"/>
+              <w:bottom w:w="90" w:type="dxa"/>
+              <w:left w:w="90" w:type="dxa"/>
+              <w:right w:w="90" w:type="dxa"/>
+            </w:tcMar>
+          </w:tcPr>
+          <w:p>
+            <w:pPr>
+              <w:spacing w:after="20" w:before="20" w:line="247" w:lineRule="auto"/>
+            </w:pPr>
+            <w:r>
+              <w:rPr>
+                <w:b/>
+                <w:color w:val="FFFFFF"/>
+                <w:sz w:val="18"/>
+              </w:rPr>
+              <w:t>Published capacity</w:t>
+            </w:r>
+          </w:p>
+        </w:tc>
+        <w:tc>
+          <w:tcPr>
+            <w:tcW w:type="dxa" w:w="2448"/>
+            <w:vAlign w:val="center"/>
+            <w:shd w:fill="17354A"/>
+            <w:tcBorders>
+              <w:top w:val="single" w:sz="4" w:color="D9D9D9"/>
+              <w:left w:val="single" w:sz="4" w:color="D9D9D9"/>
+              <w:bottom w:val="single" w:sz="4" w:color="D9D9D9"/>
+              <w:right w:val="single" w:sz="4" w:color="D9D9D9"/>
+            </w:tcBorders>
+            <w:tcMar>
+              <w:top w:w="90" w:type="dxa"/>
+              <w:bottom w:w="90" w:type="dxa"/>
+              <w:left w:w="90" w:type="dxa"/>
+              <w:right w:w="90" w:type="dxa"/>
+            </w:tcMar>
+          </w:tcPr>
+          <w:p>
+            <w:pPr>
+              <w:spacing w:after="20" w:before="20" w:line="247" w:lineRule="auto"/>
+            </w:pPr>
+            <w:r>
+              <w:rPr>
+                <w:b/>
+                <w:color w:val="FFFFFF"/>
+                <w:sz w:val="18"/>
+              </w:rPr>
+              <w:t>Tested scope</w:t>
+            </w:r>
+          </w:p>
+        </w:tc>
+      </w:tr>
+      <w:tr>
+        <w:trPr>
+          <w:cantSplit/>
+        </w:trPr>
+        <w:tc>
+          <w:tcPr>
+            <w:tcW w:type="dxa" w:w="1224"/>
+            <w:vAlign w:val="center"/>
+            <w:shd w:fill="FFFFFF"/>
+            <w:tcBorders>
+              <w:top w:val="single" w:sz="4" w:color="D9D9D9"/>
+              <w:left w:val="single" w:sz="4" w:color="D9D9D9"/>
+              <w:bottom w:val="single" w:sz="4" w:color="D9D9D9"/>
+              <w:right w:val="single" w:sz="4" w:color="D9D9D9"/>
+            </w:tcBorders>
+            <w:tcMar>
+              <w:top w:w="90" w:type="dxa"/>
+              <w:bottom w:w="90" w:type="dxa"/>
+              <w:left w:w="90" w:type="dxa"/>
+              <w:right w:w="90" w:type="dxa"/>
+            </w:tcMar>
+          </w:tcPr>
+          <w:p>
+            <w:pPr>
+              <w:spacing w:after="20" w:before="20" w:line="247" w:lineRule="auto"/>
+            </w:pPr>
+            <w:r>
+              <w:rPr>
+                <w:b w:val="0"/>
+                <w:color w:val="000000"/>
+                <w:sz w:val="18"/>
+              </w:rPr>
+              <w:t>Jev 1.13</w:t>
+            </w:r>
+          </w:p>
+        </w:tc>
+        <w:tc>
+          <w:tcPr>
+            <w:tcW w:type="dxa" w:w="2592"/>
+            <w:vAlign w:val="center"/>
+            <w:shd w:fill="FFFFFF"/>
+            <w:tcBorders>
+              <w:top w:val="single" w:sz="4" w:color="D9D9D9"/>
+              <w:left w:val="single" w:sz="4" w:color="D9D9D9"/>
+              <w:bottom w:val="single" w:sz="4" w:color="D9D9D9"/>
+              <w:right w:val="single" w:sz="4" w:color="D9D9D9"/>
+            </w:tcBorders>
+            <w:tcMar>
+              <w:top w:w="90" w:type="dxa"/>
+              <w:bottom w:w="90" w:type="dxa"/>
+              <w:left w:w="90" w:type="dxa"/>
+              <w:right w:w="90" w:type="dxa"/>
+            </w:tcMar>
+          </w:tcPr>
+          <w:p>
+            <w:pPr>
+              <w:spacing w:after="20" w:before="20" w:line="247" w:lineRule="auto"/>
+            </w:pPr>
+            <w:r>
+              <w:rPr>
+                <w:b w:val="0"/>
+                <w:color w:val="000000"/>
+                <w:sz w:val="18"/>
+              </w:rPr>
+              <w:t>Text: string, JSON object, or array of text values. No native image, audio or video. [S1]</w:t>
+            </w:r>
+          </w:p>
+        </w:tc>
+        <w:tc>
+          <w:tcPr>
+            <w:tcW w:type="dxa" w:w="3816"/>
+            <w:vAlign w:val="center"/>
+            <w:shd w:fill="FFFFFF"/>
+            <w:tcBorders>
+              <w:top w:val="single" w:sz="4" w:color="D9D9D9"/>
+              <w:left w:val="single" w:sz="4" w:color="D9D9D9"/>
+              <w:bottom w:val="single" w:sz="4" w:color="D9D9D9"/>
+              <w:right w:val="single" w:sz="4" w:color="D9D9D9"/>
+            </w:tcBorders>
+            <w:tcMar>
+              <w:top w:w="90" w:type="dxa"/>
+              <w:bottom w:w="90" w:type="dxa"/>
+              <w:left w:w="90" w:type="dxa"/>
+              <w:right w:w="90" w:type="dxa"/>
+            </w:tcMar>
+          </w:tcPr>
+          <w:p>
+            <w:pPr>
+              <w:spacing w:after="20" w:before="20" w:line="247" w:lineRule="auto"/>
+            </w:pPr>
+            <w:r>
+              <w:rPr>
+                <w:b w:val="0"/>
+                <w:color w:val="000000"/>
+                <w:sz w:val="18"/>
+              </w:rPr>
+              <w:t>Direct API: 64k total request; state + longest question limited to 32k. OpenRouter: 32,000 context. These are service limits, not a disclosed architectural maximum. [S1, S2]</w:t>
+            </w:r>
+          </w:p>
+        </w:tc>
+        <w:tc>
+          <w:tcPr>
+            <w:tcW w:type="dxa" w:w="2448"/>
+            <w:vAlign w:val="center"/>
+            <w:shd w:fill="FFFFFF"/>
+            <w:tcBorders>
+              <w:top w:val="single" w:sz="4" w:color="D9D9D9"/>
+              <w:left w:val="single" w:sz="4" w:color="D9D9D9"/>
+              <w:bottom w:val="single" w:sz="4" w:color="D9D9D9"/>
+              <w:right w:val="single" w:sz="4" w:color="D9D9D9"/>
+            </w:tcBorders>
+            <w:tcMar>
+              <w:top w:w="90" w:type="dxa"/>
+              <w:bottom w:w="90" w:type="dxa"/>
+              <w:left w:w="90" w:type="dxa"/>
+              <w:right w:w="90" w:type="dxa"/>
+            </w:tcMar>
+          </w:tcPr>
+          <w:p>
+            <w:pPr>
+              <w:spacing w:after="20" w:before="20" w:line="247" w:lineRule="auto"/>
+            </w:pPr>
+            <w:r>
+              <w:rPr>
+                <w:b w:val="0"/>
+                <w:color w:val="000000"/>
+                <w:sz w:val="18"/>
+              </w:rPr>
+              <w:t>Full text through about 16k document tokens. No image or binary ingestion tested.</w:t>
+            </w:r>
+          </w:p>
+        </w:tc>
+      </w:tr>
+      <w:tr>
+        <w:trPr>
+          <w:cantSplit/>
+        </w:trPr>
+        <w:tc>
+          <w:tcPr>
+            <w:tcW w:type="dxa" w:w="1224"/>
+            <w:vAlign w:val="center"/>
+            <w:shd w:fill="F1F5F7"/>
+            <w:tcBorders>
+              <w:top w:val="single" w:sz="4" w:color="D9D9D9"/>
+              <w:left w:val="single" w:sz="4" w:color="D9D9D9"/>
+              <w:bottom w:val="single" w:sz="4" w:color="D9D9D9"/>
+              <w:right w:val="single" w:sz="4" w:color="D9D9D9"/>
+            </w:tcBorders>
+            <w:tcMar>
+              <w:top w:w="90" w:type="dxa"/>
+              <w:bottom w:w="90" w:type="dxa"/>
+              <w:left w:w="90" w:type="dxa"/>
+              <w:right w:w="90" w:type="dxa"/>
+            </w:tcMar>
+          </w:tcPr>
+          <w:p>
+            <w:pPr>
+              <w:spacing w:after="20" w:before="20" w:line="247" w:lineRule="auto"/>
+            </w:pPr>
+            <w:r>
+              <w:rPr>
+                <w:b w:val="0"/>
+                <w:color w:val="000000"/>
+                <w:sz w:val="18"/>
+              </w:rPr>
+              <w:t>Laya English</w:t>
+            </w:r>
+          </w:p>
+        </w:tc>
+        <w:tc>
+          <w:tcPr>
+            <w:tcW w:type="dxa" w:w="2592"/>
+            <w:vAlign w:val="center"/>
+            <w:shd w:fill="F1F5F7"/>
+            <w:tcBorders>
+              <w:top w:val="single" w:sz="4" w:color="D9D9D9"/>
+              <w:left w:val="single" w:sz="4" w:color="D9D9D9"/>
+              <w:bottom w:val="single" w:sz="4" w:color="D9D9D9"/>
+              <w:right w:val="single" w:sz="4" w:color="D9D9D9"/>
+            </w:tcBorders>
+            <w:tcMar>
+              <w:top w:w="90" w:type="dxa"/>
+              <w:bottom w:w="90" w:type="dxa"/>
+              <w:left w:w="90" w:type="dxa"/>
+              <w:right w:w="90" w:type="dxa"/>
+            </w:tcMar>
+          </w:tcPr>
+          <w:p>
+            <w:pPr>
+              <w:spacing w:after="20" w:before="20" w:line="247" w:lineRule="auto"/>
+            </w:pPr>
+            <w:r>
+              <w:rPr>
+                <w:b w:val="0"/>
+                <w:color w:val="000000"/>
+                <w:sz w:val="18"/>
+              </w:rPr>
+              <w:t>Text and JSON serialized as text. Text encoder; no documented native image, audio or video path. [S3]</w:t>
+            </w:r>
+          </w:p>
+        </w:tc>
+        <w:tc>
+          <w:tcPr>
+            <w:tcW w:type="dxa" w:w="3816"/>
+            <w:vAlign w:val="center"/>
+            <w:shd w:fill="F1F5F7"/>
+            <w:tcBorders>
+              <w:top w:val="single" w:sz="4" w:color="D9D9D9"/>
+              <w:left w:val="single" w:sz="4" w:color="D9D9D9"/>
+              <w:bottom w:val="single" w:sz="4" w:color="D9D9D9"/>
+              <w:right w:val="single" w:sz="4" w:color="D9D9D9"/>
+            </w:tcBorders>
+            <w:tcMar>
+              <w:top w:w="90" w:type="dxa"/>
+              <w:bottom w:w="90" w:type="dxa"/>
+              <w:left w:w="90" w:type="dxa"/>
+              <w:right w:w="90" w:type="dxa"/>
+            </w:tcMar>
+          </w:tcPr>
+          <w:p>
+            <w:pPr>
+              <w:spacing w:after="20" w:before="20" w:line="247" w:lineRule="auto"/>
+            </w:pPr>
+            <w:r>
+              <w:rPr>
+                <w:b w:val="0"/>
+                <w:color w:val="000000"/>
+                <w:sz w:val="18"/>
+              </w:rPr>
+              <w:t>512-token default sequence. ModernBERT backbone config lists 8,192 positions; that is not a validated Laya end-to-end limit. Multilingual default 1,024; its card states encoder capacity up to 8,192. [S3, S4]</w:t>
+            </w:r>
+          </w:p>
+        </w:tc>
+        <w:tc>
+          <w:tcPr>
+            <w:tcW w:type="dxa" w:w="2448"/>
+            <w:vAlign w:val="center"/>
+            <w:shd w:fill="F1F5F7"/>
+            <w:tcBorders>
+              <w:top w:val="single" w:sz="4" w:color="D9D9D9"/>
+              <w:left w:val="single" w:sz="4" w:color="D9D9D9"/>
+              <w:bottom w:val="single" w:sz="4" w:color="D9D9D9"/>
+              <w:right w:val="single" w:sz="4" w:color="D9D9D9"/>
+            </w:tcBorders>
+            <w:tcMar>
+              <w:top w:w="90" w:type="dxa"/>
+              <w:bottom w:w="90" w:type="dxa"/>
+              <w:left w:w="90" w:type="dxa"/>
+              <w:right w:w="90" w:type="dxa"/>
+            </w:tcMar>
+          </w:tcPr>
+          <w:p>
+            <w:pPr>
+              <w:spacing w:after="20" w:before="20" w:line="247" w:lineRule="auto"/>
+            </w:pPr>
+            <w:r>
+              <w:rPr>
+                <w:b w:val="0"/>
+                <w:color w:val="000000"/>
+                <w:sz w:val="18"/>
+              </w:rPr>
+              <w:t>324 document tokens after this question. Longer documents used windows. No expanded-context checkpoint evaluation.</w:t>
+            </w:r>
+          </w:p>
+        </w:tc>
+      </w:tr>
+      <w:tr>
+        <w:trPr>
+          <w:cantSplit/>
+        </w:trPr>
+        <w:tc>
+          <w:tcPr>
+            <w:tcW w:type="dxa" w:w="1224"/>
+            <w:vAlign w:val="center"/>
+            <w:shd w:fill="FFFFFF"/>
+            <w:tcBorders>
+              <w:top w:val="single" w:sz="4" w:color="D9D9D9"/>
+              <w:left w:val="single" w:sz="4" w:color="D9D9D9"/>
+              <w:bottom w:val="single" w:sz="4" w:color="D9D9D9"/>
+              <w:right w:val="single" w:sz="4" w:color="D9D9D9"/>
+            </w:tcBorders>
+            <w:tcMar>
+              <w:top w:w="90" w:type="dxa"/>
+              <w:bottom w:w="90" w:type="dxa"/>
+              <w:left w:w="90" w:type="dxa"/>
+              <w:right w:w="90" w:type="dxa"/>
+            </w:tcMar>
+          </w:tcPr>
+          <w:p>
+            <w:pPr>
+              <w:spacing w:after="20" w:before="20" w:line="247" w:lineRule="auto"/>
+            </w:pPr>
+            <w:r>
+              <w:rPr>
+                <w:b w:val="0"/>
+                <w:color w:val="000000"/>
+                <w:sz w:val="18"/>
+              </w:rPr>
+              <w:t>GPT-5.6 Luna</w:t>
+            </w:r>
+          </w:p>
+        </w:tc>
+        <w:tc>
+          <w:tcPr>
+            <w:tcW w:type="dxa" w:w="2592"/>
+            <w:vAlign w:val="center"/>
+            <w:shd w:fill="FFFFFF"/>
+            <w:tcBorders>
+              <w:top w:val="single" w:sz="4" w:color="D9D9D9"/>
+              <w:left w:val="single" w:sz="4" w:color="D9D9D9"/>
+              <w:bottom w:val="single" w:sz="4" w:color="D9D9D9"/>
+              <w:right w:val="single" w:sz="4" w:color="D9D9D9"/>
+            </w:tcBorders>
+            <w:tcMar>
+              <w:top w:w="90" w:type="dxa"/>
+              <w:bottom w:w="90" w:type="dxa"/>
+              <w:left w:w="90" w:type="dxa"/>
+              <w:right w:w="90" w:type="dxa"/>
+            </w:tcMar>
+          </w:tcPr>
+          <w:p>
+            <w:pPr>
+              <w:spacing w:after="20" w:before="20" w:line="247" w:lineRule="auto"/>
+            </w:pPr>
+            <w:r>
+              <w:rPr>
+                <w:b w:val="0"/>
+                <w:color w:val="000000"/>
+                <w:sz w:val="18"/>
+              </w:rPr>
+              <w:t>Text and image input; text output. Audio and video unsupported in the model specification. [S5]</w:t>
+            </w:r>
+          </w:p>
+        </w:tc>
+        <w:tc>
+          <w:tcPr>
+            <w:tcW w:type="dxa" w:w="3816"/>
+            <w:vAlign w:val="center"/>
+            <w:shd w:fill="FFFFFF"/>
+            <w:tcBorders>
+              <w:top w:val="single" w:sz="4" w:color="D9D9D9"/>
+              <w:left w:val="single" w:sz="4" w:color="D9D9D9"/>
+              <w:bottom w:val="single" w:sz="4" w:color="D9D9D9"/>
+              <w:right w:val="single" w:sz="4" w:color="D9D9D9"/>
+            </w:tcBorders>
+            <w:tcMar>
+              <w:top w:w="90" w:type="dxa"/>
+              <w:bottom w:w="90" w:type="dxa"/>
+              <w:left w:w="90" w:type="dxa"/>
+              <w:right w:w="90" w:type="dxa"/>
+            </w:tcMar>
+          </w:tcPr>
+          <w:p>
+            <w:pPr>
+              <w:spacing w:after="20" w:before="20" w:line="247" w:lineRule="auto"/>
+            </w:pPr>
+            <w:r>
+              <w:rPr>
+                <w:b w:val="0"/>
+                <w:color w:val="000000"/>
+                <w:sz w:val="18"/>
+              </w:rPr>
+              <w:t>Published context: 1,050,000 tokens; maximum output: 128,000. Budget input, instructions and output within the context; Codex route availability/settings may differ. [S5]</w:t>
+            </w:r>
+          </w:p>
+        </w:tc>
+        <w:tc>
+          <w:tcPr>
+            <w:tcW w:type="dxa" w:w="2448"/>
+            <w:vAlign w:val="center"/>
+            <w:shd w:fill="FFFFFF"/>
+            <w:tcBorders>
+              <w:top w:val="single" w:sz="4" w:color="D9D9D9"/>
+              <w:left w:val="single" w:sz="4" w:color="D9D9D9"/>
+              <w:bottom w:val="single" w:sz="4" w:color="D9D9D9"/>
+              <w:right w:val="single" w:sz="4" w:color="D9D9D9"/>
+            </w:tcBorders>
+            <w:tcMar>
+              <w:top w:w="90" w:type="dxa"/>
+              <w:bottom w:w="90" w:type="dxa"/>
+              <w:left w:w="90" w:type="dxa"/>
+              <w:right w:w="90" w:type="dxa"/>
+            </w:tcMar>
+          </w:tcPr>
+          <w:p>
+            <w:pPr>
+              <w:spacing w:after="20" w:before="20" w:line="247" w:lineRule="auto"/>
+            </w:pPr>
+            <w:r>
+              <w:rPr>
+                <w:b w:val="0"/>
+                <w:color w:val="000000"/>
+                <w:sz w:val="18"/>
+              </w:rPr>
+              <w:t>Text only through about 16k document tokens. Images and published maximum context not tested.</w:t>
+            </w:r>
+          </w:p>
+        </w:tc>
+      </w:tr>
+    </w:tbl>
+    <w:p>
+      <w:pPr>
+        <w:spacing w:after="40"/>
+      </w:pPr>
+    </w:p>
+    <w:p>
+      <w:r>
+        <w:rPr>
+          <w:b w:val="0"/>
+        </w:rPr>
+        <w:t>PDF and DOCX are containers, not modalities. Jev and Laya require extracted text, including OCR for scans. Luna supports image input, but file upload and PDF conversion depend on the serving interface; native PDF ingestion was not verified here. Published context is not an accuracy guarantee, and a backbone limit does not validate the Laya decision head at that length.</w:t>
+      </w:r>
+    </w:p>
+    <w:p>
+      <w:pPr>
+        <w:pStyle w:val="Heading2"/>
+      </w:pPr>
+      <w:r>
+        <w:t>Primary source evidence</w:t>
+      </w:r>
+    </w:p>
+    <w:p>
+      <w:r>
+        <w:rPr>
+          <w:b/>
+          <w:sz w:val="18"/>
+        </w:rPr>
+        <w:t>S1  TypeSafe model limits and modalities</w:t>
+      </w:r>
+    </w:p>
+    <w:p>
+      <w:r>
+        <w:rPr>
+          <w:b w:val="0"/>
+          <w:sz w:val="16"/>
+        </w:rPr>
+        <w:t>https://docs.typesafe.ai/models</w:t>
+      </w:r>
+    </w:p>
+    <w:p>
+      <w:r>
+        <w:rPr>
+          <w:b/>
+          <w:sz w:val="18"/>
+        </w:rPr>
+        <w:t>S2  OpenRouter Jev route</w:t>
+      </w:r>
+    </w:p>
+    <w:p>
+      <w:r>
+        <w:rPr>
+          <w:b w:val="0"/>
+          <w:sz w:val="16"/>
+        </w:rPr>
+        <w:t>https://openrouter.ai/typesafe/jev-1.13</w:t>
+      </w:r>
+    </w:p>
+    <w:p>
+      <w:r>
+        <w:rPr>
+          <w:b/>
+          <w:sz w:val="18"/>
+        </w:rPr>
+        <w:t>S3  Laya model card and configurations</w:t>
+      </w:r>
+    </w:p>
+    <w:p>
+      <w:r>
+        <w:rPr>
+          <w:b w:val="0"/>
+          <w:sz w:val="16"/>
+        </w:rPr>
+        <w:t>https://huggingface.co/convaiinnovations/laya</w:t>
+      </w:r>
+    </w:p>
+    <w:p>
+      <w:r>
+        <w:rPr>
+          <w:b/>
+          <w:sz w:val="18"/>
+        </w:rPr>
+        <w:t>S4  ModernBERT encoder configuration</w:t>
+      </w:r>
+    </w:p>
+    <w:p>
+      <w:r>
+        <w:rPr>
+          <w:b w:val="0"/>
+          <w:sz w:val="16"/>
+        </w:rPr>
+        <w:t>https://huggingface.co/answerdotai/ModernBERT-large/blob/main/config.json</w:t>
+      </w:r>
+    </w:p>
+    <w:p>
+      <w:r>
+        <w:rPr>
+          <w:b/>
+          <w:sz w:val="18"/>
+        </w:rPr>
+        <w:t>S5  OpenAI Luna model specification</w:t>
+      </w:r>
+    </w:p>
+    <w:p>
+      <w:r>
+        <w:rPr>
+          <w:b w:val="0"/>
+          <w:sz w:val="16"/>
+        </w:rPr>
+        <w:t>https://developers.openai.com/api/docs/models/gpt-5.6-luna</w:t>
+      </w:r>
+    </w:p>
     <w:sectPr>
       <w:footerReference w:type="default" r:id="rId9"/>
       <w:pgSz w:w="12240" w:h="15840"/>

</xml_diff>

<commit_message>
Add partial OpenJev evaluation and emphasize chunked Laya results
</commit_message>
<xml_diff>
--- a/reports/2026-09-22-Auto-Claims-Classification-Executive-Report.docx
+++ b/reports/2026-09-22-Auto-Claims-Classification-Executive-Report.docx
@@ -41,7 +41,7 @@
         <w:rPr>
           <w:b w:val="0"/>
         </w:rPr>
-        <w:t>The pilot compared Jev 1.13, default English Laya, and GPT-5.6 Luna on ten initial documents, eight additional boundary cases, and 12 length probes. Jev and Luna matched every author-assigned label. Laya made three errors on the initial set and four on the boundary set; chunking recovered its length-probe failures.</w:t>
+        <w:t>The pilot compared Jev 1.13, default English Laya, and GPT-5.6 Luna on ten initial documents, eight additional boundary cases, and 12 length probes. Jev and Luna matched every author-assigned label. Laya made three errors on the initial set and four on the boundary set; chunked Laya classified all 12 long-input probes correctly. A later OpenJev demo run completed only two scored cases before quota exhaustion (page 16).</w:t>
       </w:r>
     </w:p>
     <w:tbl>
@@ -329,9 +329,9 @@
               </w:rPr>
               <w:t>Jev / Luna 12/12</w:t>
               <w:br/>
-              <w:t>Laya prefix 4/12</w:t>
+              <w:t>Laya chunks 12/12</w:t>
               <w:br/>
-              <w:t>Laya chunks 12/12</w:t>
+              <w:t>Prefix control 4/12</w:t>
             </w:r>
           </w:p>
         </w:tc>
@@ -10926,6 +10926,942 @@
         <w:t>https://developers.openai.com/api/docs/models/gpt-5.6-luna</w:t>
       </w:r>
     </w:p>
+    <w:p>
+      <w:r>
+        <w:br w:type="page"/>
+      </w:r>
+    </w:p>
+    <w:p>
+      <w:pPr>
+        <w:pStyle w:val="Heading1"/>
+      </w:pPr>
+      <w:r>
+        <w:t>OpenJev additional evaluation and limitations</w:t>
+      </w:r>
+    </w:p>
+    <w:p>
+      <w:r>
+        <w:rPr>
+          <w:b w:val="0"/>
+        </w:rPr>
+        <w:t>Added 23 September 2026. The public community demo completed two scored initial documents correctly, then rejected the third request because the anonymous ZeroGPU quota was exhausted. OpenJev is partially tested; its results cannot be ranked against the completed three-model evaluation.</w:t>
+      </w:r>
+    </w:p>
+    <w:tbl>
+      <w:tblPr>
+        <w:tblW w:type="auto" w:w="0"/>
+        <w:jc w:val="center"/>
+        <w:tblLayout w:type="fixed"/>
+        <w:tblLook w:firstColumn="1" w:firstRow="1" w:lastColumn="0" w:lastRow="0" w:noHBand="0" w:noVBand="1" w:val="04A0"/>
+      </w:tblPr>
+      <w:tblGrid>
+        <w:gridCol w:w="2880"/>
+        <w:gridCol w:w="1872"/>
+        <w:gridCol w:w="5328"/>
+      </w:tblGrid>
+      <w:tr>
+        <w:trPr>
+          <w:cantSplit/>
+          <w:tblHeader/>
+        </w:trPr>
+        <w:tc>
+          <w:tcPr>
+            <w:tcW w:type="dxa" w:w="2880"/>
+            <w:vAlign w:val="center"/>
+            <w:shd w:fill="17354A"/>
+            <w:tcBorders>
+              <w:top w:val="single" w:sz="4" w:color="D9D9D9"/>
+              <w:left w:val="single" w:sz="4" w:color="D9D9D9"/>
+              <w:bottom w:val="single" w:sz="4" w:color="D9D9D9"/>
+              <w:right w:val="single" w:sz="4" w:color="D9D9D9"/>
+            </w:tcBorders>
+            <w:tcMar>
+              <w:top w:w="90" w:type="dxa"/>
+              <w:bottom w:w="90" w:type="dxa"/>
+              <w:left w:w="90" w:type="dxa"/>
+              <w:right w:w="90" w:type="dxa"/>
+            </w:tcMar>
+          </w:tcPr>
+          <w:p>
+            <w:pPr>
+              <w:spacing w:after="20" w:before="20" w:line="247" w:lineRule="auto"/>
+            </w:pPr>
+            <w:r>
+              <w:rPr>
+                <w:b/>
+                <w:color w:val="FFFFFF"/>
+                <w:sz w:val="18"/>
+              </w:rPr>
+              <w:t>Test group</w:t>
+            </w:r>
+          </w:p>
+        </w:tc>
+        <w:tc>
+          <w:tcPr>
+            <w:tcW w:type="dxa" w:w="1872"/>
+            <w:vAlign w:val="center"/>
+            <w:shd w:fill="17354A"/>
+            <w:tcBorders>
+              <w:top w:val="single" w:sz="4" w:color="D9D9D9"/>
+              <w:left w:val="single" w:sz="4" w:color="D9D9D9"/>
+              <w:bottom w:val="single" w:sz="4" w:color="D9D9D9"/>
+              <w:right w:val="single" w:sz="4" w:color="D9D9D9"/>
+            </w:tcBorders>
+            <w:tcMar>
+              <w:top w:w="90" w:type="dxa"/>
+              <w:bottom w:w="90" w:type="dxa"/>
+              <w:left w:w="90" w:type="dxa"/>
+              <w:right w:w="90" w:type="dxa"/>
+            </w:tcMar>
+          </w:tcPr>
+          <w:p>
+            <w:pPr>
+              <w:spacing w:after="20" w:before="20" w:line="247" w:lineRule="auto"/>
+            </w:pPr>
+            <w:r>
+              <w:rPr>
+                <w:b/>
+                <w:color w:val="FFFFFF"/>
+                <w:sz w:val="18"/>
+              </w:rPr>
+              <w:t>Completed</w:t>
+            </w:r>
+          </w:p>
+        </w:tc>
+        <w:tc>
+          <w:tcPr>
+            <w:tcW w:type="dxa" w:w="5328"/>
+            <w:vAlign w:val="center"/>
+            <w:shd w:fill="17354A"/>
+            <w:tcBorders>
+              <w:top w:val="single" w:sz="4" w:color="D9D9D9"/>
+              <w:left w:val="single" w:sz="4" w:color="D9D9D9"/>
+              <w:bottom w:val="single" w:sz="4" w:color="D9D9D9"/>
+              <w:right w:val="single" w:sz="4" w:color="D9D9D9"/>
+            </w:tcBorders>
+            <w:tcMar>
+              <w:top w:w="90" w:type="dxa"/>
+              <w:bottom w:w="90" w:type="dxa"/>
+              <w:left w:w="90" w:type="dxa"/>
+              <w:right w:w="90" w:type="dxa"/>
+            </w:tcMar>
+          </w:tcPr>
+          <w:p>
+            <w:pPr>
+              <w:spacing w:after="20" w:before="20" w:line="247" w:lineRule="auto"/>
+            </w:pPr>
+            <w:r>
+              <w:rPr>
+                <w:b/>
+                <w:color w:val="FFFFFF"/>
+                <w:sz w:val="18"/>
+              </w:rPr>
+              <w:t>Observed outcome</w:t>
+            </w:r>
+          </w:p>
+        </w:tc>
+      </w:tr>
+      <w:tr>
+        <w:trPr>
+          <w:cantSplit/>
+        </w:trPr>
+        <w:tc>
+          <w:tcPr>
+            <w:tcW w:type="dxa" w:w="2880"/>
+            <w:vAlign w:val="center"/>
+            <w:shd w:fill="FFFFFF"/>
+            <w:tcBorders>
+              <w:top w:val="single" w:sz="4" w:color="D9D9D9"/>
+              <w:left w:val="single" w:sz="4" w:color="D9D9D9"/>
+              <w:bottom w:val="single" w:sz="4" w:color="D9D9D9"/>
+              <w:right w:val="single" w:sz="4" w:color="D9D9D9"/>
+            </w:tcBorders>
+            <w:tcMar>
+              <w:top w:w="90" w:type="dxa"/>
+              <w:bottom w:w="90" w:type="dxa"/>
+              <w:left w:w="90" w:type="dxa"/>
+              <w:right w:w="90" w:type="dxa"/>
+            </w:tcMar>
+          </w:tcPr>
+          <w:p>
+            <w:pPr>
+              <w:spacing w:after="20" w:before="20" w:line="247" w:lineRule="auto"/>
+            </w:pPr>
+            <w:r>
+              <w:rPr>
+                <w:b w:val="0"/>
+                <w:color w:val="000000"/>
+                <w:sz w:val="18"/>
+              </w:rPr>
+              <w:t>Initial ten documents</w:t>
+            </w:r>
+          </w:p>
+        </w:tc>
+        <w:tc>
+          <w:tcPr>
+            <w:tcW w:type="dxa" w:w="1872"/>
+            <w:vAlign w:val="center"/>
+            <w:shd w:fill="FFFFFF"/>
+            <w:tcBorders>
+              <w:top w:val="single" w:sz="4" w:color="D9D9D9"/>
+              <w:left w:val="single" w:sz="4" w:color="D9D9D9"/>
+              <w:bottom w:val="single" w:sz="4" w:color="D9D9D9"/>
+              <w:right w:val="single" w:sz="4" w:color="D9D9D9"/>
+            </w:tcBorders>
+            <w:tcMar>
+              <w:top w:w="90" w:type="dxa"/>
+              <w:bottom w:w="90" w:type="dxa"/>
+              <w:left w:w="90" w:type="dxa"/>
+              <w:right w:w="90" w:type="dxa"/>
+            </w:tcMar>
+          </w:tcPr>
+          <w:p>
+            <w:pPr>
+              <w:spacing w:after="20" w:before="20" w:line="247" w:lineRule="auto"/>
+            </w:pPr>
+            <w:r>
+              <w:rPr>
+                <w:b w:val="0"/>
+                <w:color w:val="000000"/>
+                <w:sz w:val="18"/>
+              </w:rPr>
+              <w:t>2 of 10</w:t>
+            </w:r>
+          </w:p>
+        </w:tc>
+        <w:tc>
+          <w:tcPr>
+            <w:tcW w:type="dxa" w:w="5328"/>
+            <w:vAlign w:val="center"/>
+            <w:shd w:fill="FFFFFF"/>
+            <w:tcBorders>
+              <w:top w:val="single" w:sz="4" w:color="D9D9D9"/>
+              <w:left w:val="single" w:sz="4" w:color="D9D9D9"/>
+              <w:bottom w:val="single" w:sz="4" w:color="D9D9D9"/>
+              <w:right w:val="single" w:sz="4" w:color="D9D9D9"/>
+            </w:tcBorders>
+            <w:tcMar>
+              <w:top w:w="90" w:type="dxa"/>
+              <w:bottom w:w="90" w:type="dxa"/>
+              <w:left w:w="90" w:type="dxa"/>
+              <w:right w:w="90" w:type="dxa"/>
+            </w:tcMar>
+          </w:tcPr>
+          <w:p>
+            <w:pPr>
+              <w:spacing w:after="20" w:before="20" w:line="247" w:lineRule="auto"/>
+            </w:pPr>
+            <w:r>
+              <w:rPr>
+                <w:b w:val="0"/>
+                <w:color w:val="000000"/>
+                <w:sz w:val="18"/>
+              </w:rPr>
+              <w:t>Police report and demand letter correct; remaining eight not run.</w:t>
+            </w:r>
+          </w:p>
+        </w:tc>
+      </w:tr>
+      <w:tr>
+        <w:trPr>
+          <w:cantSplit/>
+        </w:trPr>
+        <w:tc>
+          <w:tcPr>
+            <w:tcW w:type="dxa" w:w="2880"/>
+            <w:vAlign w:val="center"/>
+            <w:shd w:fill="F1F5F7"/>
+            <w:tcBorders>
+              <w:top w:val="single" w:sz="4" w:color="D9D9D9"/>
+              <w:left w:val="single" w:sz="4" w:color="D9D9D9"/>
+              <w:bottom w:val="single" w:sz="4" w:color="D9D9D9"/>
+              <w:right w:val="single" w:sz="4" w:color="D9D9D9"/>
+            </w:tcBorders>
+            <w:tcMar>
+              <w:top w:w="90" w:type="dxa"/>
+              <w:bottom w:w="90" w:type="dxa"/>
+              <w:left w:w="90" w:type="dxa"/>
+              <w:right w:w="90" w:type="dxa"/>
+            </w:tcMar>
+          </w:tcPr>
+          <w:p>
+            <w:pPr>
+              <w:spacing w:after="20" w:before="20" w:line="247" w:lineRule="auto"/>
+            </w:pPr>
+            <w:r>
+              <w:rPr>
+                <w:b w:val="0"/>
+                <w:color w:val="000000"/>
+                <w:sz w:val="18"/>
+              </w:rPr>
+              <w:t>Eight boundary cases</w:t>
+            </w:r>
+          </w:p>
+        </w:tc>
+        <w:tc>
+          <w:tcPr>
+            <w:tcW w:type="dxa" w:w="1872"/>
+            <w:vAlign w:val="center"/>
+            <w:shd w:fill="F1F5F7"/>
+            <w:tcBorders>
+              <w:top w:val="single" w:sz="4" w:color="D9D9D9"/>
+              <w:left w:val="single" w:sz="4" w:color="D9D9D9"/>
+              <w:bottom w:val="single" w:sz="4" w:color="D9D9D9"/>
+              <w:right w:val="single" w:sz="4" w:color="D9D9D9"/>
+            </w:tcBorders>
+            <w:tcMar>
+              <w:top w:w="90" w:type="dxa"/>
+              <w:bottom w:w="90" w:type="dxa"/>
+              <w:left w:w="90" w:type="dxa"/>
+              <w:right w:w="90" w:type="dxa"/>
+            </w:tcMar>
+          </w:tcPr>
+          <w:p>
+            <w:pPr>
+              <w:spacing w:after="20" w:before="20" w:line="247" w:lineRule="auto"/>
+            </w:pPr>
+            <w:r>
+              <w:rPr>
+                <w:b w:val="0"/>
+                <w:color w:val="000000"/>
+                <w:sz w:val="18"/>
+              </w:rPr>
+              <w:t>0 of 8</w:t>
+            </w:r>
+          </w:p>
+        </w:tc>
+        <w:tc>
+          <w:tcPr>
+            <w:tcW w:type="dxa" w:w="5328"/>
+            <w:vAlign w:val="center"/>
+            <w:shd w:fill="F1F5F7"/>
+            <w:tcBorders>
+              <w:top w:val="single" w:sz="4" w:color="D9D9D9"/>
+              <w:left w:val="single" w:sz="4" w:color="D9D9D9"/>
+              <w:bottom w:val="single" w:sz="4" w:color="D9D9D9"/>
+              <w:right w:val="single" w:sz="4" w:color="D9D9D9"/>
+            </w:tcBorders>
+            <w:tcMar>
+              <w:top w:w="90" w:type="dxa"/>
+              <w:bottom w:w="90" w:type="dxa"/>
+              <w:left w:w="90" w:type="dxa"/>
+              <w:right w:w="90" w:type="dxa"/>
+            </w:tcMar>
+          </w:tcPr>
+          <w:p>
+            <w:pPr>
+              <w:spacing w:after="20" w:before="20" w:line="247" w:lineRule="auto"/>
+            </w:pPr>
+            <w:r>
+              <w:rPr>
+                <w:b w:val="0"/>
+                <w:color w:val="000000"/>
+                <w:sz w:val="18"/>
+              </w:rPr>
+              <w:t>Not run.</w:t>
+            </w:r>
+          </w:p>
+        </w:tc>
+      </w:tr>
+      <w:tr>
+        <w:trPr>
+          <w:cantSplit/>
+        </w:trPr>
+        <w:tc>
+          <w:tcPr>
+            <w:tcW w:type="dxa" w:w="2880"/>
+            <w:vAlign w:val="center"/>
+            <w:shd w:fill="FFFFFF"/>
+            <w:tcBorders>
+              <w:top w:val="single" w:sz="4" w:color="D9D9D9"/>
+              <w:left w:val="single" w:sz="4" w:color="D9D9D9"/>
+              <w:bottom w:val="single" w:sz="4" w:color="D9D9D9"/>
+              <w:right w:val="single" w:sz="4" w:color="D9D9D9"/>
+            </w:tcBorders>
+            <w:tcMar>
+              <w:top w:w="90" w:type="dxa"/>
+              <w:bottom w:w="90" w:type="dxa"/>
+              <w:left w:w="90" w:type="dxa"/>
+              <w:right w:w="90" w:type="dxa"/>
+            </w:tcMar>
+          </w:tcPr>
+          <w:p>
+            <w:pPr>
+              <w:spacing w:after="20" w:before="20" w:line="247" w:lineRule="auto"/>
+            </w:pPr>
+            <w:r>
+              <w:rPr>
+                <w:b w:val="0"/>
+                <w:color w:val="000000"/>
+                <w:sz w:val="18"/>
+              </w:rPr>
+              <w:t>Twelve length probes</w:t>
+            </w:r>
+          </w:p>
+        </w:tc>
+        <w:tc>
+          <w:tcPr>
+            <w:tcW w:type="dxa" w:w="1872"/>
+            <w:vAlign w:val="center"/>
+            <w:shd w:fill="FFFFFF"/>
+            <w:tcBorders>
+              <w:top w:val="single" w:sz="4" w:color="D9D9D9"/>
+              <w:left w:val="single" w:sz="4" w:color="D9D9D9"/>
+              <w:bottom w:val="single" w:sz="4" w:color="D9D9D9"/>
+              <w:right w:val="single" w:sz="4" w:color="D9D9D9"/>
+            </w:tcBorders>
+            <w:tcMar>
+              <w:top w:w="90" w:type="dxa"/>
+              <w:bottom w:w="90" w:type="dxa"/>
+              <w:left w:w="90" w:type="dxa"/>
+              <w:right w:w="90" w:type="dxa"/>
+            </w:tcMar>
+          </w:tcPr>
+          <w:p>
+            <w:pPr>
+              <w:spacing w:after="20" w:before="20" w:line="247" w:lineRule="auto"/>
+            </w:pPr>
+            <w:r>
+              <w:rPr>
+                <w:b w:val="0"/>
+                <w:color w:val="000000"/>
+                <w:sz w:val="18"/>
+              </w:rPr>
+              <w:t>0 of 12</w:t>
+            </w:r>
+          </w:p>
+        </w:tc>
+        <w:tc>
+          <w:tcPr>
+            <w:tcW w:type="dxa" w:w="5328"/>
+            <w:vAlign w:val="center"/>
+            <w:shd w:fill="FFFFFF"/>
+            <w:tcBorders>
+              <w:top w:val="single" w:sz="4" w:color="D9D9D9"/>
+              <w:left w:val="single" w:sz="4" w:color="D9D9D9"/>
+              <w:bottom w:val="single" w:sz="4" w:color="D9D9D9"/>
+              <w:right w:val="single" w:sz="4" w:color="D9D9D9"/>
+            </w:tcBorders>
+            <w:tcMar>
+              <w:top w:w="90" w:type="dxa"/>
+              <w:bottom w:w="90" w:type="dxa"/>
+              <w:left w:w="90" w:type="dxa"/>
+              <w:right w:w="90" w:type="dxa"/>
+            </w:tcMar>
+          </w:tcPr>
+          <w:p>
+            <w:pPr>
+              <w:spacing w:after="20" w:before="20" w:line="247" w:lineRule="auto"/>
+            </w:pPr>
+            <w:r>
+              <w:rPr>
+                <w:b w:val="0"/>
+                <w:color w:val="000000"/>
+                <w:sz w:val="18"/>
+              </w:rPr>
+              <w:t>Not run.</w:t>
+            </w:r>
+          </w:p>
+        </w:tc>
+      </w:tr>
+    </w:tbl>
+    <w:p>
+      <w:pPr>
+        <w:spacing w:after="40"/>
+      </w:pPr>
+    </w:p>
+    <w:p>
+      <w:pPr>
+        <w:pStyle w:val="Heading2"/>
+      </w:pPr>
+      <w:r>
+        <w:t>Actual route and score meaning</w:t>
+      </w:r>
+    </w:p>
+    <w:p>
+      <w:r>
+        <w:rPr>
+          <w:b w:val="0"/>
+        </w:rPr>
+        <w:t>The model-card-linked community Space serves openjev/openjev-FP8 dequantized to BF16 through Transformers on ZeroGPU. It returns probabilities from candidate-letter logits without the official helper choice temperature of 0.85. Its Gradio confidence fields are class probabilities, not a separately returned native confidence statistic. The full document text was preserved; shared instructions were prepended and label definitions appended to names, with commas replaced by semicolons for CSV transport.</w:t>
+      </w:r>
+    </w:p>
+    <w:tbl>
+      <w:tblPr>
+        <w:tblW w:type="auto" w:w="0"/>
+        <w:jc w:val="center"/>
+        <w:tblLayout w:type="fixed"/>
+        <w:tblLook w:firstColumn="1" w:firstRow="1" w:lastColumn="0" w:lastRow="0" w:noHBand="0" w:noVBand="1" w:val="04A0"/>
+      </w:tblPr>
+      <w:tblGrid>
+        <w:gridCol w:w="1440"/>
+        <w:gridCol w:w="2880"/>
+        <w:gridCol w:w="2880"/>
+        <w:gridCol w:w="2880"/>
+      </w:tblGrid>
+      <w:tr>
+        <w:trPr>
+          <w:cantSplit/>
+          <w:tblHeader/>
+        </w:trPr>
+        <w:tc>
+          <w:tcPr>
+            <w:tcW w:type="dxa" w:w="1440"/>
+            <w:vAlign w:val="center"/>
+            <w:shd w:fill="17354A"/>
+            <w:tcBorders>
+              <w:top w:val="single" w:sz="4" w:color="D9D9D9"/>
+              <w:left w:val="single" w:sz="4" w:color="D9D9D9"/>
+              <w:bottom w:val="single" w:sz="4" w:color="D9D9D9"/>
+              <w:right w:val="single" w:sz="4" w:color="D9D9D9"/>
+            </w:tcBorders>
+            <w:tcMar>
+              <w:top w:w="90" w:type="dxa"/>
+              <w:bottom w:w="90" w:type="dxa"/>
+              <w:left w:w="90" w:type="dxa"/>
+              <w:right w:w="90" w:type="dxa"/>
+            </w:tcMar>
+          </w:tcPr>
+          <w:p>
+            <w:pPr>
+              <w:spacing w:after="20" w:before="20" w:line="247" w:lineRule="auto"/>
+            </w:pPr>
+            <w:r>
+              <w:rPr>
+                <w:b/>
+                <w:color w:val="FFFFFF"/>
+                <w:sz w:val="18"/>
+              </w:rPr>
+              <w:t>Document</w:t>
+            </w:r>
+          </w:p>
+        </w:tc>
+        <w:tc>
+          <w:tcPr>
+            <w:tcW w:type="dxa" w:w="2880"/>
+            <w:vAlign w:val="center"/>
+            <w:shd w:fill="17354A"/>
+            <w:tcBorders>
+              <w:top w:val="single" w:sz="4" w:color="D9D9D9"/>
+              <w:left w:val="single" w:sz="4" w:color="D9D9D9"/>
+              <w:bottom w:val="single" w:sz="4" w:color="D9D9D9"/>
+              <w:right w:val="single" w:sz="4" w:color="D9D9D9"/>
+            </w:tcBorders>
+            <w:tcMar>
+              <w:top w:w="90" w:type="dxa"/>
+              <w:bottom w:w="90" w:type="dxa"/>
+              <w:left w:w="90" w:type="dxa"/>
+              <w:right w:w="90" w:type="dxa"/>
+            </w:tcMar>
+          </w:tcPr>
+          <w:p>
+            <w:pPr>
+              <w:spacing w:after="20" w:before="20" w:line="247" w:lineRule="auto"/>
+            </w:pPr>
+            <w:r>
+              <w:rPr>
+                <w:b/>
+                <w:color w:val="FFFFFF"/>
+                <w:sz w:val="18"/>
+              </w:rPr>
+              <w:t>Prediction</w:t>
+            </w:r>
+          </w:p>
+        </w:tc>
+        <w:tc>
+          <w:tcPr>
+            <w:tcW w:type="dxa" w:w="2880"/>
+            <w:vAlign w:val="center"/>
+            <w:shd w:fill="17354A"/>
+            <w:tcBorders>
+              <w:top w:val="single" w:sz="4" w:color="D9D9D9"/>
+              <w:left w:val="single" w:sz="4" w:color="D9D9D9"/>
+              <w:bottom w:val="single" w:sz="4" w:color="D9D9D9"/>
+              <w:right w:val="single" w:sz="4" w:color="D9D9D9"/>
+            </w:tcBorders>
+            <w:tcMar>
+              <w:top w:w="90" w:type="dxa"/>
+              <w:bottom w:w="90" w:type="dxa"/>
+              <w:left w:w="90" w:type="dxa"/>
+              <w:right w:w="90" w:type="dxa"/>
+            </w:tcMar>
+          </w:tcPr>
+          <w:p>
+            <w:pPr>
+              <w:spacing w:after="20" w:before="20" w:line="247" w:lineRule="auto"/>
+            </w:pPr>
+            <w:r>
+              <w:rPr>
+                <w:b/>
+                <w:color w:val="FFFFFF"/>
+                <w:sz w:val="18"/>
+              </w:rPr>
+              <w:t>Selected probability</w:t>
+            </w:r>
+          </w:p>
+        </w:tc>
+        <w:tc>
+          <w:tcPr>
+            <w:tcW w:type="dxa" w:w="2880"/>
+            <w:vAlign w:val="center"/>
+            <w:shd w:fill="17354A"/>
+            <w:tcBorders>
+              <w:top w:val="single" w:sz="4" w:color="D9D9D9"/>
+              <w:left w:val="single" w:sz="4" w:color="D9D9D9"/>
+              <w:bottom w:val="single" w:sz="4" w:color="D9D9D9"/>
+              <w:right w:val="single" w:sz="4" w:color="D9D9D9"/>
+            </w:tcBorders>
+            <w:tcMar>
+              <w:top w:w="90" w:type="dxa"/>
+              <w:bottom w:w="90" w:type="dxa"/>
+              <w:left w:w="90" w:type="dxa"/>
+              <w:right w:w="90" w:type="dxa"/>
+            </w:tcMar>
+          </w:tcPr>
+          <w:p>
+            <w:pPr>
+              <w:spacing w:after="20" w:before="20" w:line="247" w:lineRule="auto"/>
+            </w:pPr>
+            <w:r>
+              <w:rPr>
+                <w:b/>
+                <w:color w:val="FFFFFF"/>
+                <w:sz w:val="18"/>
+              </w:rPr>
+              <w:t>Client seconds</w:t>
+            </w:r>
+          </w:p>
+        </w:tc>
+      </w:tr>
+      <w:tr>
+        <w:trPr>
+          <w:cantSplit/>
+        </w:trPr>
+        <w:tc>
+          <w:tcPr>
+            <w:tcW w:type="dxa" w:w="1440"/>
+            <w:vAlign w:val="center"/>
+            <w:shd w:fill="FFFFFF"/>
+            <w:tcBorders>
+              <w:top w:val="single" w:sz="4" w:color="D9D9D9"/>
+              <w:left w:val="single" w:sz="4" w:color="D9D9D9"/>
+              <w:bottom w:val="single" w:sz="4" w:color="D9D9D9"/>
+              <w:right w:val="single" w:sz="4" w:color="D9D9D9"/>
+            </w:tcBorders>
+            <w:tcMar>
+              <w:top w:w="90" w:type="dxa"/>
+              <w:bottom w:w="90" w:type="dxa"/>
+              <w:left w:w="90" w:type="dxa"/>
+              <w:right w:w="90" w:type="dxa"/>
+            </w:tcMar>
+          </w:tcPr>
+          <w:p>
+            <w:pPr>
+              <w:spacing w:after="20" w:before="20" w:line="247" w:lineRule="auto"/>
+            </w:pPr>
+            <w:r>
+              <w:rPr>
+                <w:b w:val="0"/>
+                <w:color w:val="000000"/>
+                <w:sz w:val="18"/>
+              </w:rPr>
+              <w:t>doc_01</w:t>
+            </w:r>
+          </w:p>
+        </w:tc>
+        <w:tc>
+          <w:tcPr>
+            <w:tcW w:type="dxa" w:w="2880"/>
+            <w:vAlign w:val="center"/>
+            <w:shd w:fill="FFFFFF"/>
+            <w:tcBorders>
+              <w:top w:val="single" w:sz="4" w:color="D9D9D9"/>
+              <w:left w:val="single" w:sz="4" w:color="D9D9D9"/>
+              <w:bottom w:val="single" w:sz="4" w:color="D9D9D9"/>
+              <w:right w:val="single" w:sz="4" w:color="D9D9D9"/>
+            </w:tcBorders>
+            <w:tcMar>
+              <w:top w:w="90" w:type="dxa"/>
+              <w:bottom w:w="90" w:type="dxa"/>
+              <w:left w:w="90" w:type="dxa"/>
+              <w:right w:w="90" w:type="dxa"/>
+            </w:tcMar>
+          </w:tcPr>
+          <w:p>
+            <w:pPr>
+              <w:spacing w:after="20" w:before="20" w:line="247" w:lineRule="auto"/>
+            </w:pPr>
+            <w:r>
+              <w:rPr>
+                <w:b w:val="0"/>
+                <w:color w:val="000000"/>
+                <w:sz w:val="18"/>
+              </w:rPr>
+              <w:t>police_report</w:t>
+            </w:r>
+          </w:p>
+        </w:tc>
+        <w:tc>
+          <w:tcPr>
+            <w:tcW w:type="dxa" w:w="2880"/>
+            <w:vAlign w:val="center"/>
+            <w:shd w:fill="FFFFFF"/>
+            <w:tcBorders>
+              <w:top w:val="single" w:sz="4" w:color="D9D9D9"/>
+              <w:left w:val="single" w:sz="4" w:color="D9D9D9"/>
+              <w:bottom w:val="single" w:sz="4" w:color="D9D9D9"/>
+              <w:right w:val="single" w:sz="4" w:color="D9D9D9"/>
+            </w:tcBorders>
+            <w:tcMar>
+              <w:top w:w="90" w:type="dxa"/>
+              <w:bottom w:w="90" w:type="dxa"/>
+              <w:left w:w="90" w:type="dxa"/>
+              <w:right w:w="90" w:type="dxa"/>
+            </w:tcMar>
+          </w:tcPr>
+          <w:p>
+            <w:pPr>
+              <w:spacing w:after="20" w:before="20" w:line="247" w:lineRule="auto"/>
+            </w:pPr>
+            <w:r>
+              <w:rPr>
+                <w:b w:val="0"/>
+                <w:color w:val="000000"/>
+                <w:sz w:val="18"/>
+              </w:rPr>
+              <w:t>0.9961</w:t>
+            </w:r>
+          </w:p>
+        </w:tc>
+        <w:tc>
+          <w:tcPr>
+            <w:tcW w:type="dxa" w:w="2880"/>
+            <w:vAlign w:val="center"/>
+            <w:shd w:fill="FFFFFF"/>
+            <w:tcBorders>
+              <w:top w:val="single" w:sz="4" w:color="D9D9D9"/>
+              <w:left w:val="single" w:sz="4" w:color="D9D9D9"/>
+              <w:bottom w:val="single" w:sz="4" w:color="D9D9D9"/>
+              <w:right w:val="single" w:sz="4" w:color="D9D9D9"/>
+            </w:tcBorders>
+            <w:tcMar>
+              <w:top w:w="90" w:type="dxa"/>
+              <w:bottom w:w="90" w:type="dxa"/>
+              <w:left w:w="90" w:type="dxa"/>
+              <w:right w:w="90" w:type="dxa"/>
+            </w:tcMar>
+          </w:tcPr>
+          <w:p>
+            <w:pPr>
+              <w:spacing w:after="20" w:before="20" w:line="247" w:lineRule="auto"/>
+            </w:pPr>
+            <w:r>
+              <w:rPr>
+                <w:b w:val="0"/>
+                <w:color w:val="000000"/>
+                <w:sz w:val="18"/>
+              </w:rPr>
+              <w:t>7.13</w:t>
+            </w:r>
+          </w:p>
+        </w:tc>
+      </w:tr>
+      <w:tr>
+        <w:trPr>
+          <w:cantSplit/>
+        </w:trPr>
+        <w:tc>
+          <w:tcPr>
+            <w:tcW w:type="dxa" w:w="1440"/>
+            <w:vAlign w:val="center"/>
+            <w:shd w:fill="F1F5F7"/>
+            <w:tcBorders>
+              <w:top w:val="single" w:sz="4" w:color="D9D9D9"/>
+              <w:left w:val="single" w:sz="4" w:color="D9D9D9"/>
+              <w:bottom w:val="single" w:sz="4" w:color="D9D9D9"/>
+              <w:right w:val="single" w:sz="4" w:color="D9D9D9"/>
+            </w:tcBorders>
+            <w:tcMar>
+              <w:top w:w="90" w:type="dxa"/>
+              <w:bottom w:w="90" w:type="dxa"/>
+              <w:left w:w="90" w:type="dxa"/>
+              <w:right w:w="90" w:type="dxa"/>
+            </w:tcMar>
+          </w:tcPr>
+          <w:p>
+            <w:pPr>
+              <w:spacing w:after="20" w:before="20" w:line="247" w:lineRule="auto"/>
+            </w:pPr>
+            <w:r>
+              <w:rPr>
+                <w:b w:val="0"/>
+                <w:color w:val="000000"/>
+                <w:sz w:val="18"/>
+              </w:rPr>
+              <w:t>doc_02</w:t>
+            </w:r>
+          </w:p>
+        </w:tc>
+        <w:tc>
+          <w:tcPr>
+            <w:tcW w:type="dxa" w:w="2880"/>
+            <w:vAlign w:val="center"/>
+            <w:shd w:fill="F1F5F7"/>
+            <w:tcBorders>
+              <w:top w:val="single" w:sz="4" w:color="D9D9D9"/>
+              <w:left w:val="single" w:sz="4" w:color="D9D9D9"/>
+              <w:bottom w:val="single" w:sz="4" w:color="D9D9D9"/>
+              <w:right w:val="single" w:sz="4" w:color="D9D9D9"/>
+            </w:tcBorders>
+            <w:tcMar>
+              <w:top w:w="90" w:type="dxa"/>
+              <w:bottom w:w="90" w:type="dxa"/>
+              <w:left w:w="90" w:type="dxa"/>
+              <w:right w:w="90" w:type="dxa"/>
+            </w:tcMar>
+          </w:tcPr>
+          <w:p>
+            <w:pPr>
+              <w:spacing w:after="20" w:before="20" w:line="247" w:lineRule="auto"/>
+            </w:pPr>
+            <w:r>
+              <w:rPr>
+                <w:b w:val="0"/>
+                <w:color w:val="000000"/>
+                <w:sz w:val="18"/>
+              </w:rPr>
+              <w:t>demand_letter</w:t>
+            </w:r>
+          </w:p>
+        </w:tc>
+        <w:tc>
+          <w:tcPr>
+            <w:tcW w:type="dxa" w:w="2880"/>
+            <w:vAlign w:val="center"/>
+            <w:shd w:fill="F1F5F7"/>
+            <w:tcBorders>
+              <w:top w:val="single" w:sz="4" w:color="D9D9D9"/>
+              <w:left w:val="single" w:sz="4" w:color="D9D9D9"/>
+              <w:bottom w:val="single" w:sz="4" w:color="D9D9D9"/>
+              <w:right w:val="single" w:sz="4" w:color="D9D9D9"/>
+            </w:tcBorders>
+            <w:tcMar>
+              <w:top w:w="90" w:type="dxa"/>
+              <w:bottom w:w="90" w:type="dxa"/>
+              <w:left w:w="90" w:type="dxa"/>
+              <w:right w:w="90" w:type="dxa"/>
+            </w:tcMar>
+          </w:tcPr>
+          <w:p>
+            <w:pPr>
+              <w:spacing w:after="20" w:before="20" w:line="247" w:lineRule="auto"/>
+            </w:pPr>
+            <w:r>
+              <w:rPr>
+                <w:b w:val="0"/>
+                <w:color w:val="000000"/>
+                <w:sz w:val="18"/>
+              </w:rPr>
+              <w:t>0.9961</w:t>
+            </w:r>
+          </w:p>
+        </w:tc>
+        <w:tc>
+          <w:tcPr>
+            <w:tcW w:type="dxa" w:w="2880"/>
+            <w:vAlign w:val="center"/>
+            <w:shd w:fill="F1F5F7"/>
+            <w:tcBorders>
+              <w:top w:val="single" w:sz="4" w:color="D9D9D9"/>
+              <w:left w:val="single" w:sz="4" w:color="D9D9D9"/>
+              <w:bottom w:val="single" w:sz="4" w:color="D9D9D9"/>
+              <w:right w:val="single" w:sz="4" w:color="D9D9D9"/>
+            </w:tcBorders>
+            <w:tcMar>
+              <w:top w:w="90" w:type="dxa"/>
+              <w:bottom w:w="90" w:type="dxa"/>
+              <w:left w:w="90" w:type="dxa"/>
+              <w:right w:w="90" w:type="dxa"/>
+            </w:tcMar>
+          </w:tcPr>
+          <w:p>
+            <w:pPr>
+              <w:spacing w:after="20" w:before="20" w:line="247" w:lineRule="auto"/>
+            </w:pPr>
+            <w:r>
+              <w:rPr>
+                <w:b w:val="0"/>
+                <w:color w:val="000000"/>
+                <w:sz w:val="18"/>
+              </w:rPr>
+              <w:t>0.65</w:t>
+            </w:r>
+          </w:p>
+        </w:tc>
+      </w:tr>
+    </w:tbl>
+    <w:p>
+      <w:pPr>
+        <w:spacing w:after="40"/>
+      </w:pPr>
+    </w:p>
+    <w:p>
+      <w:r>
+        <w:rPr>
+          <w:b w:val="0"/>
+        </w:rPr>
+        <w:t>One preliminary connectivity pilot was excluded. Client timings include network, queue and GPU allocation; two observations do not establish typical speed. No paid inference calls were made. The demo source revision and method are recorded in results/openjev-demo.metadata.json; the quota rejection is preserved separately. No automatic retries were made.</w:t>
+      </w:r>
+    </w:p>
+    <w:p>
+      <w:pPr>
+        <w:pStyle w:val="Heading2"/>
+      </w:pPr>
+      <w:r>
+        <w:t>Published capabilities and deployment constraints</w:t>
+      </w:r>
+    </w:p>
+    <w:p>
+      <w:r>
+        <w:rPr>
+          <w:b w:val="0"/>
+        </w:rPr>
+        <w:t>The official model card describes text, JSON/DOM and screenshot input, one image per request, prompts up to 16,384 tokens, and 52 choices in one pass. Larger choice sets require several passes. The public demo exposes text and at most 26 labels. MLX builds are text-only. A 16k document plus instructions can exceed the official prompt budget; our longest probe has not been tested on OpenJev.</w:t>
+      </w:r>
+    </w:p>
+    <w:p>
+      <w:r>
+        <w:rPr>
+          <w:b w:val="0"/>
+        </w:rPr>
+        <w:t>The smallest published MLX build is about 15 GB; available local disk was 9.6 GiB. The weights are CC BY-NC 4.0, requiring attention to noncommercial licensing before any commercial deployment. OpenJev is independent of TypeSafe. An authenticated demo quota, suitable endpoint, or local checkpoint is required to finish this benchmark.</w:t>
+      </w:r>
+    </w:p>
+    <w:p>
+      <w:pPr>
+        <w:pStyle w:val="Heading2"/>
+      </w:pPr>
+      <w:r>
+        <w:t>Laya presentation correction</w:t>
+      </w:r>
+    </w:p>
+    <w:p>
+      <w:r>
+        <w:rPr>
+          <w:b w:val="0"/>
+        </w:rPr>
+        <w:t>Chunked Laya achieved 12/12 correct long-input classifications, including 3/3 at 5k tokens. The one-pager now leads with that result; the 4/12 prefix score is retained as a truncation control. Initial and boundary inputs fit one window, so their 7/10 and 4/8 results are separate from chunk recovery.</w:t>
+      </w:r>
+    </w:p>
+    <w:p>
+      <w:r>
+        <w:rPr>
+          <w:b w:val="0"/>
+          <w:sz w:val="16"/>
+        </w:rPr>
+        <w:t>Sources: https://huggingface.co/openjev/openjev and https://huggingface.co/spaces/chanoian/openjev-mlx-demo/blob/037a94430fdeda9956e97b8c0f30aea0652bced6/app.py</w:t>
+      </w:r>
+    </w:p>
     <w:sectPr>
       <w:footerReference w:type="default" r:id="rId9"/>
       <w:pgSz w:w="12240" w:h="15840"/>

</xml_diff>

<commit_message>
Update OpenJev reports with ten completed short-document results
</commit_message>
<xml_diff>
--- a/reports/2026-09-22-Auto-Claims-Classification-Executive-Report.docx
+++ b/reports/2026-09-22-Auto-Claims-Classification-Executive-Report.docx
@@ -41,7 +41,7 @@
         <w:rPr>
           <w:b w:val="0"/>
         </w:rPr>
-        <w:t>The pilot compared Jev 1.13, default English Laya, and GPT-5.6 Luna on ten initial documents, eight additional boundary cases, and 12 length probes. Jev and Luna matched every author-assigned label. Laya made three errors on the initial set and four on the boundary set; chunked Laya classified all 12 long-input probes correctly. A later OpenJev demo run completed only two scored cases before quota exhaustion (page 16).</w:t>
+        <w:t>The pilot compared Jev 1.13, default English Laya, and GPT-5.6 Luna on ten initial documents, eight additional boundary cases, and 12 length probes. Jev and Luna matched every author-assigned label. Laya made three errors on the initial set and four on the boundary set; chunked Laya classified all 12 long-input probes correctly. A later OpenJev demo run correctly classified all ten initial documents before quota exhaustion (page 16).</w:t>
       </w:r>
     </w:p>
     <w:tbl>
@@ -10944,7 +10944,7 @@
         <w:rPr>
           <w:b w:val="0"/>
         </w:rPr>
-        <w:t>Added 23 September 2026. The public community demo completed two scored initial documents correctly, then rejected the third request because the anonymous ZeroGPU quota was exhausted. OpenJev is partially tested; its results cannot be ranked against the completed three-model evaluation.</w:t>
+        <w:t>Updated 26 September 2026. The public community demo correctly classified all ten initial documents. An authenticated continuation exhausted the free ZeroGPU quota before the first boundary case; a later retry was also quota-rejected. OpenJev is partially tested; its results cannot be ranked against the completed three-model evaluation.</w:t>
       </w:r>
     </w:p>
     <w:tbl>
@@ -11125,7 +11125,7 @@
                 <w:color w:val="000000"/>
                 <w:sz w:val="18"/>
               </w:rPr>
-              <w:t>2 of 10</w:t>
+              <w:t>10 of 10</w:t>
             </w:r>
           </w:p>
         </w:tc>
@@ -11157,7 +11157,7 @@
                 <w:color w:val="000000"/>
                 <w:sz w:val="18"/>
               </w:rPr>
-              <w:t>Police report and demand letter correct; remaining eight not run.</w:t>
+              <w:t>All ten predictions matched the assigned labels.</w:t>
             </w:r>
           </w:p>
         </w:tc>
@@ -11799,6 +11799,1070 @@
           </w:p>
         </w:tc>
       </w:tr>
+      <w:tr>
+        <w:trPr>
+          <w:cantSplit/>
+        </w:trPr>
+        <w:tc>
+          <w:tcPr>
+            <w:tcW w:type="dxa" w:w="1440"/>
+            <w:vAlign w:val="center"/>
+            <w:shd w:fill="FFFFFF"/>
+            <w:tcBorders>
+              <w:top w:val="single" w:sz="4" w:color="D9D9D9"/>
+              <w:left w:val="single" w:sz="4" w:color="D9D9D9"/>
+              <w:bottom w:val="single" w:sz="4" w:color="D9D9D9"/>
+              <w:right w:val="single" w:sz="4" w:color="D9D9D9"/>
+            </w:tcBorders>
+            <w:tcMar>
+              <w:top w:w="90" w:type="dxa"/>
+              <w:bottom w:w="90" w:type="dxa"/>
+              <w:left w:w="90" w:type="dxa"/>
+              <w:right w:w="90" w:type="dxa"/>
+            </w:tcMar>
+          </w:tcPr>
+          <w:p>
+            <w:pPr>
+              <w:spacing w:after="20" w:before="20" w:line="247" w:lineRule="auto"/>
+            </w:pPr>
+            <w:r>
+              <w:rPr>
+                <w:b w:val="0"/>
+                <w:color w:val="000000"/>
+                <w:sz w:val="18"/>
+              </w:rPr>
+              <w:t>doc_03</w:t>
+            </w:r>
+          </w:p>
+        </w:tc>
+        <w:tc>
+          <w:tcPr>
+            <w:tcW w:type="dxa" w:w="2880"/>
+            <w:vAlign w:val="center"/>
+            <w:shd w:fill="FFFFFF"/>
+            <w:tcBorders>
+              <w:top w:val="single" w:sz="4" w:color="D9D9D9"/>
+              <w:left w:val="single" w:sz="4" w:color="D9D9D9"/>
+              <w:bottom w:val="single" w:sz="4" w:color="D9D9D9"/>
+              <w:right w:val="single" w:sz="4" w:color="D9D9D9"/>
+            </w:tcBorders>
+            <w:tcMar>
+              <w:top w:w="90" w:type="dxa"/>
+              <w:bottom w:w="90" w:type="dxa"/>
+              <w:left w:w="90" w:type="dxa"/>
+              <w:right w:w="90" w:type="dxa"/>
+            </w:tcMar>
+          </w:tcPr>
+          <w:p>
+            <w:pPr>
+              <w:spacing w:after="20" w:before="20" w:line="247" w:lineRule="auto"/>
+            </w:pPr>
+            <w:r>
+              <w:rPr>
+                <w:b w:val="0"/>
+                <w:color w:val="000000"/>
+                <w:sz w:val="18"/>
+              </w:rPr>
+              <w:t>medical_bill</w:t>
+            </w:r>
+          </w:p>
+        </w:tc>
+        <w:tc>
+          <w:tcPr>
+            <w:tcW w:type="dxa" w:w="2880"/>
+            <w:vAlign w:val="center"/>
+            <w:shd w:fill="FFFFFF"/>
+            <w:tcBorders>
+              <w:top w:val="single" w:sz="4" w:color="D9D9D9"/>
+              <w:left w:val="single" w:sz="4" w:color="D9D9D9"/>
+              <w:bottom w:val="single" w:sz="4" w:color="D9D9D9"/>
+              <w:right w:val="single" w:sz="4" w:color="D9D9D9"/>
+            </w:tcBorders>
+            <w:tcMar>
+              <w:top w:w="90" w:type="dxa"/>
+              <w:bottom w:w="90" w:type="dxa"/>
+              <w:left w:w="90" w:type="dxa"/>
+              <w:right w:w="90" w:type="dxa"/>
+            </w:tcMar>
+          </w:tcPr>
+          <w:p>
+            <w:pPr>
+              <w:spacing w:after="20" w:before="20" w:line="247" w:lineRule="auto"/>
+            </w:pPr>
+            <w:r>
+              <w:rPr>
+                <w:b w:val="0"/>
+                <w:color w:val="000000"/>
+                <w:sz w:val="18"/>
+              </w:rPr>
+              <w:t>0.9961</w:t>
+            </w:r>
+          </w:p>
+        </w:tc>
+        <w:tc>
+          <w:tcPr>
+            <w:tcW w:type="dxa" w:w="2880"/>
+            <w:vAlign w:val="center"/>
+            <w:shd w:fill="FFFFFF"/>
+            <w:tcBorders>
+              <w:top w:val="single" w:sz="4" w:color="D9D9D9"/>
+              <w:left w:val="single" w:sz="4" w:color="D9D9D9"/>
+              <w:bottom w:val="single" w:sz="4" w:color="D9D9D9"/>
+              <w:right w:val="single" w:sz="4" w:color="D9D9D9"/>
+            </w:tcBorders>
+            <w:tcMar>
+              <w:top w:w="90" w:type="dxa"/>
+              <w:bottom w:w="90" w:type="dxa"/>
+              <w:left w:w="90" w:type="dxa"/>
+              <w:right w:w="90" w:type="dxa"/>
+            </w:tcMar>
+          </w:tcPr>
+          <w:p>
+            <w:pPr>
+              <w:spacing w:after="20" w:before="20" w:line="247" w:lineRule="auto"/>
+            </w:pPr>
+            <w:r>
+              <w:rPr>
+                <w:b w:val="0"/>
+                <w:color w:val="000000"/>
+                <w:sz w:val="18"/>
+              </w:rPr>
+              <w:t>32.64</w:t>
+            </w:r>
+          </w:p>
+        </w:tc>
+      </w:tr>
+      <w:tr>
+        <w:trPr>
+          <w:cantSplit/>
+        </w:trPr>
+        <w:tc>
+          <w:tcPr>
+            <w:tcW w:type="dxa" w:w="1440"/>
+            <w:vAlign w:val="center"/>
+            <w:shd w:fill="F1F5F7"/>
+            <w:tcBorders>
+              <w:top w:val="single" w:sz="4" w:color="D9D9D9"/>
+              <w:left w:val="single" w:sz="4" w:color="D9D9D9"/>
+              <w:bottom w:val="single" w:sz="4" w:color="D9D9D9"/>
+              <w:right w:val="single" w:sz="4" w:color="D9D9D9"/>
+            </w:tcBorders>
+            <w:tcMar>
+              <w:top w:w="90" w:type="dxa"/>
+              <w:bottom w:w="90" w:type="dxa"/>
+              <w:left w:w="90" w:type="dxa"/>
+              <w:right w:w="90" w:type="dxa"/>
+            </w:tcMar>
+          </w:tcPr>
+          <w:p>
+            <w:pPr>
+              <w:spacing w:after="20" w:before="20" w:line="247" w:lineRule="auto"/>
+            </w:pPr>
+            <w:r>
+              <w:rPr>
+                <w:b w:val="0"/>
+                <w:color w:val="000000"/>
+                <w:sz w:val="18"/>
+              </w:rPr>
+              <w:t>doc_04</w:t>
+            </w:r>
+          </w:p>
+        </w:tc>
+        <w:tc>
+          <w:tcPr>
+            <w:tcW w:type="dxa" w:w="2880"/>
+            <w:vAlign w:val="center"/>
+            <w:shd w:fill="F1F5F7"/>
+            <w:tcBorders>
+              <w:top w:val="single" w:sz="4" w:color="D9D9D9"/>
+              <w:left w:val="single" w:sz="4" w:color="D9D9D9"/>
+              <w:bottom w:val="single" w:sz="4" w:color="D9D9D9"/>
+              <w:right w:val="single" w:sz="4" w:color="D9D9D9"/>
+            </w:tcBorders>
+            <w:tcMar>
+              <w:top w:w="90" w:type="dxa"/>
+              <w:bottom w:w="90" w:type="dxa"/>
+              <w:left w:w="90" w:type="dxa"/>
+              <w:right w:w="90" w:type="dxa"/>
+            </w:tcMar>
+          </w:tcPr>
+          <w:p>
+            <w:pPr>
+              <w:spacing w:after="20" w:before="20" w:line="247" w:lineRule="auto"/>
+            </w:pPr>
+            <w:r>
+              <w:rPr>
+                <w:b w:val="0"/>
+                <w:color w:val="000000"/>
+                <w:sz w:val="18"/>
+              </w:rPr>
+              <w:t>medical_record</w:t>
+            </w:r>
+          </w:p>
+        </w:tc>
+        <w:tc>
+          <w:tcPr>
+            <w:tcW w:type="dxa" w:w="2880"/>
+            <w:vAlign w:val="center"/>
+            <w:shd w:fill="F1F5F7"/>
+            <w:tcBorders>
+              <w:top w:val="single" w:sz="4" w:color="D9D9D9"/>
+              <w:left w:val="single" w:sz="4" w:color="D9D9D9"/>
+              <w:bottom w:val="single" w:sz="4" w:color="D9D9D9"/>
+              <w:right w:val="single" w:sz="4" w:color="D9D9D9"/>
+            </w:tcBorders>
+            <w:tcMar>
+              <w:top w:w="90" w:type="dxa"/>
+              <w:bottom w:w="90" w:type="dxa"/>
+              <w:left w:w="90" w:type="dxa"/>
+              <w:right w:w="90" w:type="dxa"/>
+            </w:tcMar>
+          </w:tcPr>
+          <w:p>
+            <w:pPr>
+              <w:spacing w:after="20" w:before="20" w:line="247" w:lineRule="auto"/>
+            </w:pPr>
+            <w:r>
+              <w:rPr>
+                <w:b w:val="0"/>
+                <w:color w:val="000000"/>
+                <w:sz w:val="18"/>
+              </w:rPr>
+              <w:t>0.9961</w:t>
+            </w:r>
+          </w:p>
+        </w:tc>
+        <w:tc>
+          <w:tcPr>
+            <w:tcW w:type="dxa" w:w="2880"/>
+            <w:vAlign w:val="center"/>
+            <w:shd w:fill="F1F5F7"/>
+            <w:tcBorders>
+              <w:top w:val="single" w:sz="4" w:color="D9D9D9"/>
+              <w:left w:val="single" w:sz="4" w:color="D9D9D9"/>
+              <w:bottom w:val="single" w:sz="4" w:color="D9D9D9"/>
+              <w:right w:val="single" w:sz="4" w:color="D9D9D9"/>
+            </w:tcBorders>
+            <w:tcMar>
+              <w:top w:w="90" w:type="dxa"/>
+              <w:bottom w:w="90" w:type="dxa"/>
+              <w:left w:w="90" w:type="dxa"/>
+              <w:right w:w="90" w:type="dxa"/>
+            </w:tcMar>
+          </w:tcPr>
+          <w:p>
+            <w:pPr>
+              <w:spacing w:after="20" w:before="20" w:line="247" w:lineRule="auto"/>
+            </w:pPr>
+            <w:r>
+              <w:rPr>
+                <w:b w:val="0"/>
+                <w:color w:val="000000"/>
+                <w:sz w:val="18"/>
+              </w:rPr>
+              <w:t>38.59</w:t>
+            </w:r>
+          </w:p>
+        </w:tc>
+      </w:tr>
+      <w:tr>
+        <w:trPr>
+          <w:cantSplit/>
+        </w:trPr>
+        <w:tc>
+          <w:tcPr>
+            <w:tcW w:type="dxa" w:w="1440"/>
+            <w:vAlign w:val="center"/>
+            <w:shd w:fill="FFFFFF"/>
+            <w:tcBorders>
+              <w:top w:val="single" w:sz="4" w:color="D9D9D9"/>
+              <w:left w:val="single" w:sz="4" w:color="D9D9D9"/>
+              <w:bottom w:val="single" w:sz="4" w:color="D9D9D9"/>
+              <w:right w:val="single" w:sz="4" w:color="D9D9D9"/>
+            </w:tcBorders>
+            <w:tcMar>
+              <w:top w:w="90" w:type="dxa"/>
+              <w:bottom w:w="90" w:type="dxa"/>
+              <w:left w:w="90" w:type="dxa"/>
+              <w:right w:w="90" w:type="dxa"/>
+            </w:tcMar>
+          </w:tcPr>
+          <w:p>
+            <w:pPr>
+              <w:spacing w:after="20" w:before="20" w:line="247" w:lineRule="auto"/>
+            </w:pPr>
+            <w:r>
+              <w:rPr>
+                <w:b w:val="0"/>
+                <w:color w:val="000000"/>
+                <w:sz w:val="18"/>
+              </w:rPr>
+              <w:t>doc_05</w:t>
+            </w:r>
+          </w:p>
+        </w:tc>
+        <w:tc>
+          <w:tcPr>
+            <w:tcW w:type="dxa" w:w="2880"/>
+            <w:vAlign w:val="center"/>
+            <w:shd w:fill="FFFFFF"/>
+            <w:tcBorders>
+              <w:top w:val="single" w:sz="4" w:color="D9D9D9"/>
+              <w:left w:val="single" w:sz="4" w:color="D9D9D9"/>
+              <w:bottom w:val="single" w:sz="4" w:color="D9D9D9"/>
+              <w:right w:val="single" w:sz="4" w:color="D9D9D9"/>
+            </w:tcBorders>
+            <w:tcMar>
+              <w:top w:w="90" w:type="dxa"/>
+              <w:bottom w:w="90" w:type="dxa"/>
+              <w:left w:w="90" w:type="dxa"/>
+              <w:right w:w="90" w:type="dxa"/>
+            </w:tcMar>
+          </w:tcPr>
+          <w:p>
+            <w:pPr>
+              <w:spacing w:after="20" w:before="20" w:line="247" w:lineRule="auto"/>
+            </w:pPr>
+            <w:r>
+              <w:rPr>
+                <w:b w:val="0"/>
+                <w:color w:val="000000"/>
+                <w:sz w:val="18"/>
+              </w:rPr>
+              <w:t>repair_estimate</w:t>
+            </w:r>
+          </w:p>
+        </w:tc>
+        <w:tc>
+          <w:tcPr>
+            <w:tcW w:type="dxa" w:w="2880"/>
+            <w:vAlign w:val="center"/>
+            <w:shd w:fill="FFFFFF"/>
+            <w:tcBorders>
+              <w:top w:val="single" w:sz="4" w:color="D9D9D9"/>
+              <w:left w:val="single" w:sz="4" w:color="D9D9D9"/>
+              <w:bottom w:val="single" w:sz="4" w:color="D9D9D9"/>
+              <w:right w:val="single" w:sz="4" w:color="D9D9D9"/>
+            </w:tcBorders>
+            <w:tcMar>
+              <w:top w:w="90" w:type="dxa"/>
+              <w:bottom w:w="90" w:type="dxa"/>
+              <w:left w:w="90" w:type="dxa"/>
+              <w:right w:w="90" w:type="dxa"/>
+            </w:tcMar>
+          </w:tcPr>
+          <w:p>
+            <w:pPr>
+              <w:spacing w:after="20" w:before="20" w:line="247" w:lineRule="auto"/>
+            </w:pPr>
+            <w:r>
+              <w:rPr>
+                <w:b w:val="0"/>
+                <w:color w:val="000000"/>
+                <w:sz w:val="18"/>
+              </w:rPr>
+              <w:t>1.0000</w:t>
+            </w:r>
+          </w:p>
+        </w:tc>
+        <w:tc>
+          <w:tcPr>
+            <w:tcW w:type="dxa" w:w="2880"/>
+            <w:vAlign w:val="center"/>
+            <w:shd w:fill="FFFFFF"/>
+            <w:tcBorders>
+              <w:top w:val="single" w:sz="4" w:color="D9D9D9"/>
+              <w:left w:val="single" w:sz="4" w:color="D9D9D9"/>
+              <w:bottom w:val="single" w:sz="4" w:color="D9D9D9"/>
+              <w:right w:val="single" w:sz="4" w:color="D9D9D9"/>
+            </w:tcBorders>
+            <w:tcMar>
+              <w:top w:w="90" w:type="dxa"/>
+              <w:bottom w:w="90" w:type="dxa"/>
+              <w:left w:w="90" w:type="dxa"/>
+              <w:right w:w="90" w:type="dxa"/>
+            </w:tcMar>
+          </w:tcPr>
+          <w:p>
+            <w:pPr>
+              <w:spacing w:after="20" w:before="20" w:line="247" w:lineRule="auto"/>
+            </w:pPr>
+            <w:r>
+              <w:rPr>
+                <w:b w:val="0"/>
+                <w:color w:val="000000"/>
+                <w:sz w:val="18"/>
+              </w:rPr>
+              <w:t>27.05</w:t>
+            </w:r>
+          </w:p>
+        </w:tc>
+      </w:tr>
+      <w:tr>
+        <w:trPr>
+          <w:cantSplit/>
+        </w:trPr>
+        <w:tc>
+          <w:tcPr>
+            <w:tcW w:type="dxa" w:w="1440"/>
+            <w:vAlign w:val="center"/>
+            <w:shd w:fill="F1F5F7"/>
+            <w:tcBorders>
+              <w:top w:val="single" w:sz="4" w:color="D9D9D9"/>
+              <w:left w:val="single" w:sz="4" w:color="D9D9D9"/>
+              <w:bottom w:val="single" w:sz="4" w:color="D9D9D9"/>
+              <w:right w:val="single" w:sz="4" w:color="D9D9D9"/>
+            </w:tcBorders>
+            <w:tcMar>
+              <w:top w:w="90" w:type="dxa"/>
+              <w:bottom w:w="90" w:type="dxa"/>
+              <w:left w:w="90" w:type="dxa"/>
+              <w:right w:w="90" w:type="dxa"/>
+            </w:tcMar>
+          </w:tcPr>
+          <w:p>
+            <w:pPr>
+              <w:spacing w:after="20" w:before="20" w:line="247" w:lineRule="auto"/>
+            </w:pPr>
+            <w:r>
+              <w:rPr>
+                <w:b w:val="0"/>
+                <w:color w:val="000000"/>
+                <w:sz w:val="18"/>
+              </w:rPr>
+              <w:t>doc_06</w:t>
+            </w:r>
+          </w:p>
+        </w:tc>
+        <w:tc>
+          <w:tcPr>
+            <w:tcW w:type="dxa" w:w="2880"/>
+            <w:vAlign w:val="center"/>
+            <w:shd w:fill="F1F5F7"/>
+            <w:tcBorders>
+              <w:top w:val="single" w:sz="4" w:color="D9D9D9"/>
+              <w:left w:val="single" w:sz="4" w:color="D9D9D9"/>
+              <w:bottom w:val="single" w:sz="4" w:color="D9D9D9"/>
+              <w:right w:val="single" w:sz="4" w:color="D9D9D9"/>
+            </w:tcBorders>
+            <w:tcMar>
+              <w:top w:w="90" w:type="dxa"/>
+              <w:bottom w:w="90" w:type="dxa"/>
+              <w:left w:w="90" w:type="dxa"/>
+              <w:right w:w="90" w:type="dxa"/>
+            </w:tcMar>
+          </w:tcPr>
+          <w:p>
+            <w:pPr>
+              <w:spacing w:after="20" w:before="20" w:line="247" w:lineRule="auto"/>
+            </w:pPr>
+            <w:r>
+              <w:rPr>
+                <w:b w:val="0"/>
+                <w:color w:val="000000"/>
+                <w:sz w:val="18"/>
+              </w:rPr>
+              <w:t>rental_invoice</w:t>
+            </w:r>
+          </w:p>
+        </w:tc>
+        <w:tc>
+          <w:tcPr>
+            <w:tcW w:type="dxa" w:w="2880"/>
+            <w:vAlign w:val="center"/>
+            <w:shd w:fill="F1F5F7"/>
+            <w:tcBorders>
+              <w:top w:val="single" w:sz="4" w:color="D9D9D9"/>
+              <w:left w:val="single" w:sz="4" w:color="D9D9D9"/>
+              <w:bottom w:val="single" w:sz="4" w:color="D9D9D9"/>
+              <w:right w:val="single" w:sz="4" w:color="D9D9D9"/>
+            </w:tcBorders>
+            <w:tcMar>
+              <w:top w:w="90" w:type="dxa"/>
+              <w:bottom w:w="90" w:type="dxa"/>
+              <w:left w:w="90" w:type="dxa"/>
+              <w:right w:w="90" w:type="dxa"/>
+            </w:tcMar>
+          </w:tcPr>
+          <w:p>
+            <w:pPr>
+              <w:spacing w:after="20" w:before="20" w:line="247" w:lineRule="auto"/>
+            </w:pPr>
+            <w:r>
+              <w:rPr>
+                <w:b w:val="0"/>
+                <w:color w:val="000000"/>
+                <w:sz w:val="18"/>
+              </w:rPr>
+              <w:t>0.9961</w:t>
+            </w:r>
+          </w:p>
+        </w:tc>
+        <w:tc>
+          <w:tcPr>
+            <w:tcW w:type="dxa" w:w="2880"/>
+            <w:vAlign w:val="center"/>
+            <w:shd w:fill="F1F5F7"/>
+            <w:tcBorders>
+              <w:top w:val="single" w:sz="4" w:color="D9D9D9"/>
+              <w:left w:val="single" w:sz="4" w:color="D9D9D9"/>
+              <w:bottom w:val="single" w:sz="4" w:color="D9D9D9"/>
+              <w:right w:val="single" w:sz="4" w:color="D9D9D9"/>
+            </w:tcBorders>
+            <w:tcMar>
+              <w:top w:w="90" w:type="dxa"/>
+              <w:bottom w:w="90" w:type="dxa"/>
+              <w:left w:w="90" w:type="dxa"/>
+              <w:right w:w="90" w:type="dxa"/>
+            </w:tcMar>
+          </w:tcPr>
+          <w:p>
+            <w:pPr>
+              <w:spacing w:after="20" w:before="20" w:line="247" w:lineRule="auto"/>
+            </w:pPr>
+            <w:r>
+              <w:rPr>
+                <w:b w:val="0"/>
+                <w:color w:val="000000"/>
+                <w:sz w:val="18"/>
+              </w:rPr>
+              <w:t>4.94</w:t>
+            </w:r>
+          </w:p>
+        </w:tc>
+      </w:tr>
+      <w:tr>
+        <w:trPr>
+          <w:cantSplit/>
+        </w:trPr>
+        <w:tc>
+          <w:tcPr>
+            <w:tcW w:type="dxa" w:w="1440"/>
+            <w:vAlign w:val="center"/>
+            <w:shd w:fill="FFFFFF"/>
+            <w:tcBorders>
+              <w:top w:val="single" w:sz="4" w:color="D9D9D9"/>
+              <w:left w:val="single" w:sz="4" w:color="D9D9D9"/>
+              <w:bottom w:val="single" w:sz="4" w:color="D9D9D9"/>
+              <w:right w:val="single" w:sz="4" w:color="D9D9D9"/>
+            </w:tcBorders>
+            <w:tcMar>
+              <w:top w:w="90" w:type="dxa"/>
+              <w:bottom w:w="90" w:type="dxa"/>
+              <w:left w:w="90" w:type="dxa"/>
+              <w:right w:w="90" w:type="dxa"/>
+            </w:tcMar>
+          </w:tcPr>
+          <w:p>
+            <w:pPr>
+              <w:spacing w:after="20" w:before="20" w:line="247" w:lineRule="auto"/>
+            </w:pPr>
+            <w:r>
+              <w:rPr>
+                <w:b w:val="0"/>
+                <w:color w:val="000000"/>
+                <w:sz w:val="18"/>
+              </w:rPr>
+              <w:t>doc_07</w:t>
+            </w:r>
+          </w:p>
+        </w:tc>
+        <w:tc>
+          <w:tcPr>
+            <w:tcW w:type="dxa" w:w="2880"/>
+            <w:vAlign w:val="center"/>
+            <w:shd w:fill="FFFFFF"/>
+            <w:tcBorders>
+              <w:top w:val="single" w:sz="4" w:color="D9D9D9"/>
+              <w:left w:val="single" w:sz="4" w:color="D9D9D9"/>
+              <w:bottom w:val="single" w:sz="4" w:color="D9D9D9"/>
+              <w:right w:val="single" w:sz="4" w:color="D9D9D9"/>
+            </w:tcBorders>
+            <w:tcMar>
+              <w:top w:w="90" w:type="dxa"/>
+              <w:bottom w:w="90" w:type="dxa"/>
+              <w:left w:w="90" w:type="dxa"/>
+              <w:right w:w="90" w:type="dxa"/>
+            </w:tcMar>
+          </w:tcPr>
+          <w:p>
+            <w:pPr>
+              <w:spacing w:after="20" w:before="20" w:line="247" w:lineRule="auto"/>
+            </w:pPr>
+            <w:r>
+              <w:rPr>
+                <w:b w:val="0"/>
+                <w:color w:val="000000"/>
+                <w:sz w:val="18"/>
+              </w:rPr>
+              <w:t>witness_statement</w:t>
+            </w:r>
+          </w:p>
+        </w:tc>
+        <w:tc>
+          <w:tcPr>
+            <w:tcW w:type="dxa" w:w="2880"/>
+            <w:vAlign w:val="center"/>
+            <w:shd w:fill="FFFFFF"/>
+            <w:tcBorders>
+              <w:top w:val="single" w:sz="4" w:color="D9D9D9"/>
+              <w:left w:val="single" w:sz="4" w:color="D9D9D9"/>
+              <w:bottom w:val="single" w:sz="4" w:color="D9D9D9"/>
+              <w:right w:val="single" w:sz="4" w:color="D9D9D9"/>
+            </w:tcBorders>
+            <w:tcMar>
+              <w:top w:w="90" w:type="dxa"/>
+              <w:bottom w:w="90" w:type="dxa"/>
+              <w:left w:w="90" w:type="dxa"/>
+              <w:right w:w="90" w:type="dxa"/>
+            </w:tcMar>
+          </w:tcPr>
+          <w:p>
+            <w:pPr>
+              <w:spacing w:after="20" w:before="20" w:line="247" w:lineRule="auto"/>
+            </w:pPr>
+            <w:r>
+              <w:rPr>
+                <w:b w:val="0"/>
+                <w:color w:val="000000"/>
+                <w:sz w:val="18"/>
+              </w:rPr>
+              <w:t>0.9961</w:t>
+            </w:r>
+          </w:p>
+        </w:tc>
+        <w:tc>
+          <w:tcPr>
+            <w:tcW w:type="dxa" w:w="2880"/>
+            <w:vAlign w:val="center"/>
+            <w:shd w:fill="FFFFFF"/>
+            <w:tcBorders>
+              <w:top w:val="single" w:sz="4" w:color="D9D9D9"/>
+              <w:left w:val="single" w:sz="4" w:color="D9D9D9"/>
+              <w:bottom w:val="single" w:sz="4" w:color="D9D9D9"/>
+              <w:right w:val="single" w:sz="4" w:color="D9D9D9"/>
+            </w:tcBorders>
+            <w:tcMar>
+              <w:top w:w="90" w:type="dxa"/>
+              <w:bottom w:w="90" w:type="dxa"/>
+              <w:left w:w="90" w:type="dxa"/>
+              <w:right w:w="90" w:type="dxa"/>
+            </w:tcMar>
+          </w:tcPr>
+          <w:p>
+            <w:pPr>
+              <w:spacing w:after="20" w:before="20" w:line="247" w:lineRule="auto"/>
+            </w:pPr>
+            <w:r>
+              <w:rPr>
+                <w:b w:val="0"/>
+                <w:color w:val="000000"/>
+                <w:sz w:val="18"/>
+              </w:rPr>
+              <w:t>8.03</w:t>
+            </w:r>
+          </w:p>
+        </w:tc>
+      </w:tr>
+      <w:tr>
+        <w:trPr>
+          <w:cantSplit/>
+        </w:trPr>
+        <w:tc>
+          <w:tcPr>
+            <w:tcW w:type="dxa" w:w="1440"/>
+            <w:vAlign w:val="center"/>
+            <w:shd w:fill="F1F5F7"/>
+            <w:tcBorders>
+              <w:top w:val="single" w:sz="4" w:color="D9D9D9"/>
+              <w:left w:val="single" w:sz="4" w:color="D9D9D9"/>
+              <w:bottom w:val="single" w:sz="4" w:color="D9D9D9"/>
+              <w:right w:val="single" w:sz="4" w:color="D9D9D9"/>
+            </w:tcBorders>
+            <w:tcMar>
+              <w:top w:w="90" w:type="dxa"/>
+              <w:bottom w:w="90" w:type="dxa"/>
+              <w:left w:w="90" w:type="dxa"/>
+              <w:right w:w="90" w:type="dxa"/>
+            </w:tcMar>
+          </w:tcPr>
+          <w:p>
+            <w:pPr>
+              <w:spacing w:after="20" w:before="20" w:line="247" w:lineRule="auto"/>
+            </w:pPr>
+            <w:r>
+              <w:rPr>
+                <w:b w:val="0"/>
+                <w:color w:val="000000"/>
+                <w:sz w:val="18"/>
+              </w:rPr>
+              <w:t>doc_08</w:t>
+            </w:r>
+          </w:p>
+        </w:tc>
+        <w:tc>
+          <w:tcPr>
+            <w:tcW w:type="dxa" w:w="2880"/>
+            <w:vAlign w:val="center"/>
+            <w:shd w:fill="F1F5F7"/>
+            <w:tcBorders>
+              <w:top w:val="single" w:sz="4" w:color="D9D9D9"/>
+              <w:left w:val="single" w:sz="4" w:color="D9D9D9"/>
+              <w:bottom w:val="single" w:sz="4" w:color="D9D9D9"/>
+              <w:right w:val="single" w:sz="4" w:color="D9D9D9"/>
+            </w:tcBorders>
+            <w:tcMar>
+              <w:top w:w="90" w:type="dxa"/>
+              <w:bottom w:w="90" w:type="dxa"/>
+              <w:left w:w="90" w:type="dxa"/>
+              <w:right w:w="90" w:type="dxa"/>
+            </w:tcMar>
+          </w:tcPr>
+          <w:p>
+            <w:pPr>
+              <w:spacing w:after="20" w:before="20" w:line="247" w:lineRule="auto"/>
+            </w:pPr>
+            <w:r>
+              <w:rPr>
+                <w:b w:val="0"/>
+                <w:color w:val="000000"/>
+                <w:sz w:val="18"/>
+              </w:rPr>
+              <w:t>coverage_letter</w:t>
+            </w:r>
+          </w:p>
+        </w:tc>
+        <w:tc>
+          <w:tcPr>
+            <w:tcW w:type="dxa" w:w="2880"/>
+            <w:vAlign w:val="center"/>
+            <w:shd w:fill="F1F5F7"/>
+            <w:tcBorders>
+              <w:top w:val="single" w:sz="4" w:color="D9D9D9"/>
+              <w:left w:val="single" w:sz="4" w:color="D9D9D9"/>
+              <w:bottom w:val="single" w:sz="4" w:color="D9D9D9"/>
+              <w:right w:val="single" w:sz="4" w:color="D9D9D9"/>
+            </w:tcBorders>
+            <w:tcMar>
+              <w:top w:w="90" w:type="dxa"/>
+              <w:bottom w:w="90" w:type="dxa"/>
+              <w:left w:w="90" w:type="dxa"/>
+              <w:right w:w="90" w:type="dxa"/>
+            </w:tcMar>
+          </w:tcPr>
+          <w:p>
+            <w:pPr>
+              <w:spacing w:after="20" w:before="20" w:line="247" w:lineRule="auto"/>
+            </w:pPr>
+            <w:r>
+              <w:rPr>
+                <w:b w:val="0"/>
+                <w:color w:val="000000"/>
+                <w:sz w:val="18"/>
+              </w:rPr>
+              <w:t>0.9961</w:t>
+            </w:r>
+          </w:p>
+        </w:tc>
+        <w:tc>
+          <w:tcPr>
+            <w:tcW w:type="dxa" w:w="2880"/>
+            <w:vAlign w:val="center"/>
+            <w:shd w:fill="F1F5F7"/>
+            <w:tcBorders>
+              <w:top w:val="single" w:sz="4" w:color="D9D9D9"/>
+              <w:left w:val="single" w:sz="4" w:color="D9D9D9"/>
+              <w:bottom w:val="single" w:sz="4" w:color="D9D9D9"/>
+              <w:right w:val="single" w:sz="4" w:color="D9D9D9"/>
+            </w:tcBorders>
+            <w:tcMar>
+              <w:top w:w="90" w:type="dxa"/>
+              <w:bottom w:w="90" w:type="dxa"/>
+              <w:left w:w="90" w:type="dxa"/>
+              <w:right w:w="90" w:type="dxa"/>
+            </w:tcMar>
+          </w:tcPr>
+          <w:p>
+            <w:pPr>
+              <w:spacing w:after="20" w:before="20" w:line="247" w:lineRule="auto"/>
+            </w:pPr>
+            <w:r>
+              <w:rPr>
+                <w:b w:val="0"/>
+                <w:color w:val="000000"/>
+                <w:sz w:val="18"/>
+              </w:rPr>
+              <w:t>39.98</w:t>
+            </w:r>
+          </w:p>
+        </w:tc>
+      </w:tr>
+      <w:tr>
+        <w:trPr>
+          <w:cantSplit/>
+        </w:trPr>
+        <w:tc>
+          <w:tcPr>
+            <w:tcW w:type="dxa" w:w="1440"/>
+            <w:vAlign w:val="center"/>
+            <w:shd w:fill="FFFFFF"/>
+            <w:tcBorders>
+              <w:top w:val="single" w:sz="4" w:color="D9D9D9"/>
+              <w:left w:val="single" w:sz="4" w:color="D9D9D9"/>
+              <w:bottom w:val="single" w:sz="4" w:color="D9D9D9"/>
+              <w:right w:val="single" w:sz="4" w:color="D9D9D9"/>
+            </w:tcBorders>
+            <w:tcMar>
+              <w:top w:w="90" w:type="dxa"/>
+              <w:bottom w:w="90" w:type="dxa"/>
+              <w:left w:w="90" w:type="dxa"/>
+              <w:right w:w="90" w:type="dxa"/>
+            </w:tcMar>
+          </w:tcPr>
+          <w:p>
+            <w:pPr>
+              <w:spacing w:after="20" w:before="20" w:line="247" w:lineRule="auto"/>
+            </w:pPr>
+            <w:r>
+              <w:rPr>
+                <w:b w:val="0"/>
+                <w:color w:val="000000"/>
+                <w:sz w:val="18"/>
+              </w:rPr>
+              <w:t>doc_09</w:t>
+            </w:r>
+          </w:p>
+        </w:tc>
+        <w:tc>
+          <w:tcPr>
+            <w:tcW w:type="dxa" w:w="2880"/>
+            <w:vAlign w:val="center"/>
+            <w:shd w:fill="FFFFFF"/>
+            <w:tcBorders>
+              <w:top w:val="single" w:sz="4" w:color="D9D9D9"/>
+              <w:left w:val="single" w:sz="4" w:color="D9D9D9"/>
+              <w:bottom w:val="single" w:sz="4" w:color="D9D9D9"/>
+              <w:right w:val="single" w:sz="4" w:color="D9D9D9"/>
+            </w:tcBorders>
+            <w:tcMar>
+              <w:top w:w="90" w:type="dxa"/>
+              <w:bottom w:w="90" w:type="dxa"/>
+              <w:left w:w="90" w:type="dxa"/>
+              <w:right w:w="90" w:type="dxa"/>
+            </w:tcMar>
+          </w:tcPr>
+          <w:p>
+            <w:pPr>
+              <w:spacing w:after="20" w:before="20" w:line="247" w:lineRule="auto"/>
+            </w:pPr>
+            <w:r>
+              <w:rPr>
+                <w:b w:val="0"/>
+                <w:color w:val="000000"/>
+                <w:sz w:val="18"/>
+              </w:rPr>
+              <w:t>subrogation_notice</w:t>
+            </w:r>
+          </w:p>
+        </w:tc>
+        <w:tc>
+          <w:tcPr>
+            <w:tcW w:type="dxa" w:w="2880"/>
+            <w:vAlign w:val="center"/>
+            <w:shd w:fill="FFFFFF"/>
+            <w:tcBorders>
+              <w:top w:val="single" w:sz="4" w:color="D9D9D9"/>
+              <w:left w:val="single" w:sz="4" w:color="D9D9D9"/>
+              <w:bottom w:val="single" w:sz="4" w:color="D9D9D9"/>
+              <w:right w:val="single" w:sz="4" w:color="D9D9D9"/>
+            </w:tcBorders>
+            <w:tcMar>
+              <w:top w:w="90" w:type="dxa"/>
+              <w:bottom w:w="90" w:type="dxa"/>
+              <w:left w:w="90" w:type="dxa"/>
+              <w:right w:w="90" w:type="dxa"/>
+            </w:tcMar>
+          </w:tcPr>
+          <w:p>
+            <w:pPr>
+              <w:spacing w:after="20" w:before="20" w:line="247" w:lineRule="auto"/>
+            </w:pPr>
+            <w:r>
+              <w:rPr>
+                <w:b w:val="0"/>
+                <w:color w:val="000000"/>
+                <w:sz w:val="18"/>
+              </w:rPr>
+              <w:t>0.9883</w:t>
+            </w:r>
+          </w:p>
+        </w:tc>
+        <w:tc>
+          <w:tcPr>
+            <w:tcW w:type="dxa" w:w="2880"/>
+            <w:vAlign w:val="center"/>
+            <w:shd w:fill="FFFFFF"/>
+            <w:tcBorders>
+              <w:top w:val="single" w:sz="4" w:color="D9D9D9"/>
+              <w:left w:val="single" w:sz="4" w:color="D9D9D9"/>
+              <w:bottom w:val="single" w:sz="4" w:color="D9D9D9"/>
+              <w:right w:val="single" w:sz="4" w:color="D9D9D9"/>
+            </w:tcBorders>
+            <w:tcMar>
+              <w:top w:w="90" w:type="dxa"/>
+              <w:bottom w:w="90" w:type="dxa"/>
+              <w:left w:w="90" w:type="dxa"/>
+              <w:right w:w="90" w:type="dxa"/>
+            </w:tcMar>
+          </w:tcPr>
+          <w:p>
+            <w:pPr>
+              <w:spacing w:after="20" w:before="20" w:line="247" w:lineRule="auto"/>
+            </w:pPr>
+            <w:r>
+              <w:rPr>
+                <w:b w:val="0"/>
+                <w:color w:val="000000"/>
+                <w:sz w:val="18"/>
+              </w:rPr>
+              <w:t>7.12</w:t>
+            </w:r>
+          </w:p>
+        </w:tc>
+      </w:tr>
+      <w:tr>
+        <w:trPr>
+          <w:cantSplit/>
+        </w:trPr>
+        <w:tc>
+          <w:tcPr>
+            <w:tcW w:type="dxa" w:w="1440"/>
+            <w:vAlign w:val="center"/>
+            <w:shd w:fill="F1F5F7"/>
+            <w:tcBorders>
+              <w:top w:val="single" w:sz="4" w:color="D9D9D9"/>
+              <w:left w:val="single" w:sz="4" w:color="D9D9D9"/>
+              <w:bottom w:val="single" w:sz="4" w:color="D9D9D9"/>
+              <w:right w:val="single" w:sz="4" w:color="D9D9D9"/>
+            </w:tcBorders>
+            <w:tcMar>
+              <w:top w:w="90" w:type="dxa"/>
+              <w:bottom w:w="90" w:type="dxa"/>
+              <w:left w:w="90" w:type="dxa"/>
+              <w:right w:w="90" w:type="dxa"/>
+            </w:tcMar>
+          </w:tcPr>
+          <w:p>
+            <w:pPr>
+              <w:spacing w:after="20" w:before="20" w:line="247" w:lineRule="auto"/>
+            </w:pPr>
+            <w:r>
+              <w:rPr>
+                <w:b w:val="0"/>
+                <w:color w:val="000000"/>
+                <w:sz w:val="18"/>
+              </w:rPr>
+              <w:t>doc_10</w:t>
+            </w:r>
+          </w:p>
+        </w:tc>
+        <w:tc>
+          <w:tcPr>
+            <w:tcW w:type="dxa" w:w="2880"/>
+            <w:vAlign w:val="center"/>
+            <w:shd w:fill="F1F5F7"/>
+            <w:tcBorders>
+              <w:top w:val="single" w:sz="4" w:color="D9D9D9"/>
+              <w:left w:val="single" w:sz="4" w:color="D9D9D9"/>
+              <w:bottom w:val="single" w:sz="4" w:color="D9D9D9"/>
+              <w:right w:val="single" w:sz="4" w:color="D9D9D9"/>
+            </w:tcBorders>
+            <w:tcMar>
+              <w:top w:w="90" w:type="dxa"/>
+              <w:bottom w:w="90" w:type="dxa"/>
+              <w:left w:w="90" w:type="dxa"/>
+              <w:right w:w="90" w:type="dxa"/>
+            </w:tcMar>
+          </w:tcPr>
+          <w:p>
+            <w:pPr>
+              <w:spacing w:after="20" w:before="20" w:line="247" w:lineRule="auto"/>
+            </w:pPr>
+            <w:r>
+              <w:rPr>
+                <w:b w:val="0"/>
+                <w:color w:val="000000"/>
+                <w:sz w:val="18"/>
+              </w:rPr>
+              <w:t>settlement_release</w:t>
+            </w:r>
+          </w:p>
+        </w:tc>
+        <w:tc>
+          <w:tcPr>
+            <w:tcW w:type="dxa" w:w="2880"/>
+            <w:vAlign w:val="center"/>
+            <w:shd w:fill="F1F5F7"/>
+            <w:tcBorders>
+              <w:top w:val="single" w:sz="4" w:color="D9D9D9"/>
+              <w:left w:val="single" w:sz="4" w:color="D9D9D9"/>
+              <w:bottom w:val="single" w:sz="4" w:color="D9D9D9"/>
+              <w:right w:val="single" w:sz="4" w:color="D9D9D9"/>
+            </w:tcBorders>
+            <w:tcMar>
+              <w:top w:w="90" w:type="dxa"/>
+              <w:bottom w:w="90" w:type="dxa"/>
+              <w:left w:w="90" w:type="dxa"/>
+              <w:right w:w="90" w:type="dxa"/>
+            </w:tcMar>
+          </w:tcPr>
+          <w:p>
+            <w:pPr>
+              <w:spacing w:after="20" w:before="20" w:line="247" w:lineRule="auto"/>
+            </w:pPr>
+            <w:r>
+              <w:rPr>
+                <w:b w:val="0"/>
+                <w:color w:val="000000"/>
+                <w:sz w:val="18"/>
+              </w:rPr>
+              <w:t>1.0000</w:t>
+            </w:r>
+          </w:p>
+        </w:tc>
+        <w:tc>
+          <w:tcPr>
+            <w:tcW w:type="dxa" w:w="2880"/>
+            <w:vAlign w:val="center"/>
+            <w:shd w:fill="F1F5F7"/>
+            <w:tcBorders>
+              <w:top w:val="single" w:sz="4" w:color="D9D9D9"/>
+              <w:left w:val="single" w:sz="4" w:color="D9D9D9"/>
+              <w:bottom w:val="single" w:sz="4" w:color="D9D9D9"/>
+              <w:right w:val="single" w:sz="4" w:color="D9D9D9"/>
+            </w:tcBorders>
+            <w:tcMar>
+              <w:top w:w="90" w:type="dxa"/>
+              <w:bottom w:w="90" w:type="dxa"/>
+              <w:left w:w="90" w:type="dxa"/>
+              <w:right w:w="90" w:type="dxa"/>
+            </w:tcMar>
+          </w:tcPr>
+          <w:p>
+            <w:pPr>
+              <w:spacing w:after="20" w:before="20" w:line="247" w:lineRule="auto"/>
+            </w:pPr>
+            <w:r>
+              <w:rPr>
+                <w:b w:val="0"/>
+                <w:color w:val="000000"/>
+                <w:sz w:val="18"/>
+              </w:rPr>
+              <w:t>34.40</w:t>
+            </w:r>
+          </w:p>
+        </w:tc>
+      </w:tr>
     </w:tbl>
     <w:p>
       <w:pPr>
@@ -11810,15 +12874,20 @@
         <w:rPr>
           <w:b w:val="0"/>
         </w:rPr>
-        <w:t>One preliminary connectivity pilot was excluded. Client timings include network, queue and GPU allocation; two observations do not establish typical speed. No paid inference calls were made. The demo source revision and method are recorded in results/openjev-demo.metadata.json; the quota rejection is preserved separately. No automatic retries were made.</w:t>
+        <w:t>One preliminary connectivity pilot was excluded. Client timings include network, queue and GPU allocation; mixed anonymous and authenticated runs do not establish intrinsic model speed. No paid inference calls were made. The demo source revision and method are recorded in results/openjev-demo.metadata.json; the quota rejection is preserved separately. No automatic retries were made.</w:t>
+      </w:r>
+    </w:p>
+    <w:p>
+      <w:r>
+        <w:br w:type="page"/>
       </w:r>
     </w:p>
     <w:p>
       <w:pPr>
-        <w:pStyle w:val="Heading2"/>
+        <w:pStyle w:val="Heading1"/>
       </w:pPr>
       <w:r>
-        <w:t>Published capabilities and deployment constraints</w:t>
+        <w:t>OpenJev capabilities and remaining tests</w:t>
       </w:r>
     </w:p>
     <w:p>
@@ -11834,7 +12903,7 @@
         <w:rPr>
           <w:b w:val="0"/>
         </w:rPr>
-        <w:t>The smallest published MLX build is about 15 GB; available local disk was 9.6 GiB. The weights are CC BY-NC 4.0, requiring attention to noncommercial licensing before any commercial deployment. OpenJev is independent of TypeSafe. An authenticated demo quota, suitable endpoint, or local checkpoint is required to finish this benchmark.</w:t>
+        <w:t>The smallest published MLX build is about 15 GB; available local disk was 9.6 GiB. The weights are CC BY-NC 4.0, requiring attention to noncommercial licensing before any commercial deployment. OpenJev is independent of TypeSafe. Renewed free quota, a suitable endpoint, or a local checkpoint is required to finish this benchmark.</w:t>
       </w:r>
     </w:p>
     <w:p>

</xml_diff>